<commit_message>
Deploy 2026-04-05 20:23 — 6 file(s) updated
</commit_message>
<xml_diff>
--- a/Mohangraphy_Technical_Guide.docx
+++ b/Mohangraphy_Technical_Guide.docx
@@ -20273,12 +20273,14 @@
       <w:pPr>
         <w:pStyle w:val="Heading3"/>
         <w:spacing w:lineRule="auto" w:line="240" w:before="0" w:after="0"/>
-        <w:rPr/>
-      </w:pPr>
-      <w:r>
-        <w:rPr>
-          <w:outline w:val="false"/>
-          <w:color w:val="555555"/>
+        <w:rPr>
+          <w:color w:val="000000"/>
+        </w:rPr>
+      </w:pPr>
+      <w:r>
+        <w:rPr>
+          <w:outline w:val="false"/>
+          <w:color w:val="000000"/>
           <w:u w:val="none" w:color="555555"/>
           <w:lang w:val="en-US"/>
         </w:rPr>
@@ -20289,12 +20291,18 @@
       <w:pPr>
         <w:pStyle w:val="Heading3"/>
         <w:spacing w:lineRule="auto" w:line="240" w:before="0" w:after="0"/>
-        <w:rPr/>
-      </w:pPr>
-      <w:r>
-        <w:rPr>
-          <w:outline w:val="false"/>
-          <w:color w:val="1A1A1A"/>
+        <w:rPr>
+          <w:b w:val="false"/>
+          <w:bCs w:val="false"/>
+          <w:color w:val="000000"/>
+        </w:rPr>
+      </w:pPr>
+      <w:r>
+        <w:rPr>
+          <w:b w:val="false"/>
+          <w:bCs w:val="false"/>
+          <w:outline w:val="false"/>
+          <w:color w:val="000000"/>
           <w:u w:val="none" w:color="1A1A1A"/>
           <w:lang w:val="en-US"/>
         </w:rPr>
@@ -20305,13 +20313,15 @@
       <w:pPr>
         <w:pStyle w:val="Heading3"/>
         <w:spacing w:lineRule="auto" w:line="240" w:before="0" w:after="0"/>
-        <w:rPr/>
+        <w:rPr>
+          <w:color w:val="000000"/>
+        </w:rPr>
       </w:pPr>
       <w:r>
         <w:rPr>
           <w:rFonts w:ascii="Courier New" w:hAnsi="Courier New"/>
           <w:outline w:val="false"/>
-          <w:color w:val="D4D4D4"/>
+          <w:color w:val="000000"/>
           <w:sz w:val="18"/>
           <w:szCs w:val="18"/>
           <w:u w:val="none" w:color="D4D4D4"/>
@@ -20324,13 +20334,15 @@
       <w:pPr>
         <w:pStyle w:val="Heading3"/>
         <w:spacing w:lineRule="auto" w:line="240" w:before="0" w:after="0"/>
-        <w:rPr/>
+        <w:rPr>
+          <w:color w:val="000000"/>
+        </w:rPr>
       </w:pPr>
       <w:r>
         <w:rPr>
           <w:rFonts w:ascii="Courier New" w:hAnsi="Courier New"/>
           <w:outline w:val="false"/>
-          <w:color w:val="D4D4D4"/>
+          <w:color w:val="000000"/>
           <w:sz w:val="18"/>
           <w:szCs w:val="18"/>
           <w:u w:val="none" w:color="D4D4D4"/>
@@ -20343,12 +20355,18 @@
       <w:pPr>
         <w:pStyle w:val="Heading3"/>
         <w:spacing w:lineRule="auto" w:line="240" w:before="0" w:after="0"/>
-        <w:rPr/>
-      </w:pPr>
-      <w:r>
-        <w:rPr>
-          <w:outline w:val="false"/>
-          <w:color w:val="1A1A1A"/>
+        <w:rPr>
+          <w:b w:val="false"/>
+          <w:bCs w:val="false"/>
+          <w:color w:val="000000"/>
+        </w:rPr>
+      </w:pPr>
+      <w:r>
+        <w:rPr>
+          <w:b w:val="false"/>
+          <w:bCs w:val="false"/>
+          <w:outline w:val="false"/>
+          <w:color w:val="000000"/>
           <w:u w:val="none" w:color="1A1A1A"/>
           <w:lang w:val="en-US"/>
         </w:rPr>
@@ -20359,22 +20377,28 @@
       <w:pPr>
         <w:pStyle w:val="Heading3"/>
         <w:spacing w:lineRule="auto" w:line="240" w:before="0" w:after="0"/>
-        <w:rPr/>
-      </w:pPr>
-      <w:r>
-        <w:rPr/>
+        <w:rPr>
+          <w:color w:val="000000"/>
+        </w:rPr>
+      </w:pPr>
+      <w:r>
+        <w:rPr>
+          <w:color w:val="000000"/>
+        </w:rPr>
       </w:r>
     </w:p>
     <w:p>
       <w:pPr>
         <w:pStyle w:val="Heading3"/>
         <w:spacing w:lineRule="auto" w:line="240" w:before="0" w:after="0"/>
-        <w:rPr/>
-      </w:pPr>
-      <w:r>
-        <w:rPr>
-          <w:outline w:val="false"/>
-          <w:color w:val="555555"/>
+        <w:rPr>
+          <w:color w:val="000000"/>
+        </w:rPr>
+      </w:pPr>
+      <w:r>
+        <w:rPr>
+          <w:outline w:val="false"/>
+          <w:color w:val="000000"/>
           <w:u w:val="none" w:color="555555"/>
           <w:lang w:val="en-US"/>
         </w:rPr>
@@ -20385,12 +20409,18 @@
       <w:pPr>
         <w:pStyle w:val="Heading3"/>
         <w:spacing w:lineRule="auto" w:line="240" w:before="0" w:after="0"/>
-        <w:rPr/>
-      </w:pPr>
-      <w:r>
-        <w:rPr>
-          <w:outline w:val="false"/>
-          <w:color w:val="1A1A1A"/>
+        <w:rPr>
+          <w:b w:val="false"/>
+          <w:bCs w:val="false"/>
+          <w:color w:val="000000"/>
+        </w:rPr>
+      </w:pPr>
+      <w:r>
+        <w:rPr>
+          <w:b w:val="false"/>
+          <w:bCs w:val="false"/>
+          <w:outline w:val="false"/>
+          <w:color w:val="000000"/>
           <w:u w:val="none" w:color="1A1A1A"/>
           <w:lang w:val="en-US"/>
         </w:rPr>
@@ -20401,13 +20431,15 @@
       <w:pPr>
         <w:pStyle w:val="Heading3"/>
         <w:spacing w:lineRule="auto" w:line="240" w:before="0" w:after="0"/>
-        <w:rPr/>
+        <w:rPr>
+          <w:color w:val="000000"/>
+        </w:rPr>
       </w:pPr>
       <w:r>
         <w:rPr>
           <w:rFonts w:ascii="Courier New" w:hAnsi="Courier New"/>
           <w:outline w:val="false"/>
-          <w:color w:val="D4D4D4"/>
+          <w:color w:val="000000"/>
           <w:sz w:val="18"/>
           <w:szCs w:val="18"/>
           <w:u w:val="none" w:color="D4D4D4"/>
@@ -20419,12 +20451,18 @@
       <w:pPr>
         <w:pStyle w:val="Heading3"/>
         <w:spacing w:lineRule="auto" w:line="240" w:before="0" w:after="0"/>
-        <w:rPr/>
-      </w:pPr>
-      <w:r>
-        <w:rPr>
-          <w:outline w:val="false"/>
-          <w:color w:val="1A1A1A"/>
+        <w:rPr>
+          <w:b w:val="false"/>
+          <w:bCs w:val="false"/>
+          <w:color w:val="000000"/>
+        </w:rPr>
+      </w:pPr>
+      <w:r>
+        <w:rPr>
+          <w:b w:val="false"/>
+          <w:bCs w:val="false"/>
+          <w:outline w:val="false"/>
+          <w:color w:val="000000"/>
           <w:u w:val="none" w:color="1A1A1A"/>
           <w:lang w:val="en-US"/>
         </w:rPr>
@@ -20435,22 +20473,32 @@
       <w:pPr>
         <w:pStyle w:val="Heading3"/>
         <w:spacing w:lineRule="auto" w:line="240" w:before="0" w:after="0"/>
-        <w:rPr/>
-      </w:pPr>
-      <w:r>
-        <w:rPr/>
+        <w:rPr>
+          <w:b w:val="false"/>
+          <w:bCs w:val="false"/>
+          <w:color w:val="000000"/>
+        </w:rPr>
+      </w:pPr>
+      <w:r>
+        <w:rPr>
+          <w:b w:val="false"/>
+          <w:bCs w:val="false"/>
+          <w:color w:val="000000"/>
+        </w:rPr>
       </w:r>
     </w:p>
     <w:p>
       <w:pPr>
         <w:pStyle w:val="Heading3"/>
         <w:spacing w:lineRule="auto" w:line="240" w:before="0" w:after="0"/>
-        <w:rPr/>
-      </w:pPr>
-      <w:r>
-        <w:rPr>
-          <w:outline w:val="false"/>
-          <w:color w:val="555555"/>
+        <w:rPr>
+          <w:color w:val="000000"/>
+        </w:rPr>
+      </w:pPr>
+      <w:r>
+        <w:rPr>
+          <w:outline w:val="false"/>
+          <w:color w:val="000000"/>
           <w:u w:val="none" w:color="555555"/>
           <w:lang w:val="en-US"/>
         </w:rPr>
@@ -20461,12 +20509,18 @@
       <w:pPr>
         <w:pStyle w:val="Heading3"/>
         <w:spacing w:lineRule="auto" w:line="240" w:before="0" w:after="0"/>
-        <w:rPr/>
-      </w:pPr>
-      <w:r>
-        <w:rPr>
-          <w:outline w:val="false"/>
-          <w:color w:val="1A1A1A"/>
+        <w:rPr>
+          <w:b w:val="false"/>
+          <w:bCs w:val="false"/>
+          <w:color w:val="000000"/>
+        </w:rPr>
+      </w:pPr>
+      <w:r>
+        <w:rPr>
+          <w:b w:val="false"/>
+          <w:bCs w:val="false"/>
+          <w:outline w:val="false"/>
+          <w:color w:val="000000"/>
           <w:u w:val="none" w:color="1A1A1A"/>
           <w:lang w:val="en-US"/>
         </w:rPr>
@@ -20477,22 +20531,32 @@
       <w:pPr>
         <w:pStyle w:val="Heading3"/>
         <w:spacing w:lineRule="auto" w:line="240" w:before="0" w:after="0"/>
-        <w:rPr/>
-      </w:pPr>
-      <w:r>
-        <w:rPr/>
+        <w:rPr>
+          <w:b w:val="false"/>
+          <w:bCs w:val="false"/>
+          <w:color w:val="000000"/>
+        </w:rPr>
+      </w:pPr>
+      <w:r>
+        <w:rPr>
+          <w:b w:val="false"/>
+          <w:bCs w:val="false"/>
+          <w:color w:val="000000"/>
+        </w:rPr>
       </w:r>
     </w:p>
     <w:p>
       <w:pPr>
         <w:pStyle w:val="Heading3"/>
         <w:spacing w:lineRule="auto" w:line="240" w:before="0" w:after="0"/>
-        <w:rPr/>
-      </w:pPr>
-      <w:r>
-        <w:rPr>
-          <w:outline w:val="false"/>
-          <w:color w:val="555555"/>
+        <w:rPr>
+          <w:color w:val="000000"/>
+        </w:rPr>
+      </w:pPr>
+      <w:r>
+        <w:rPr>
+          <w:outline w:val="false"/>
+          <w:color w:val="000000"/>
           <w:u w:val="none" w:color="555555"/>
           <w:lang w:val="en-US"/>
         </w:rPr>
@@ -20503,12 +20567,18 @@
       <w:pPr>
         <w:pStyle w:val="Heading3"/>
         <w:spacing w:lineRule="auto" w:line="240" w:before="0" w:after="0"/>
-        <w:rPr/>
-      </w:pPr>
-      <w:r>
-        <w:rPr>
-          <w:outline w:val="false"/>
-          <w:color w:val="1A1A1A"/>
+        <w:rPr>
+          <w:b w:val="false"/>
+          <w:bCs w:val="false"/>
+          <w:color w:val="000000"/>
+        </w:rPr>
+      </w:pPr>
+      <w:r>
+        <w:rPr>
+          <w:b w:val="false"/>
+          <w:bCs w:val="false"/>
+          <w:outline w:val="false"/>
+          <w:color w:val="000000"/>
           <w:u w:val="none" w:color="1A1A1A"/>
           <w:lang w:val="en-US"/>
         </w:rPr>
@@ -20519,22 +20589,32 @@
       <w:pPr>
         <w:pStyle w:val="Heading3"/>
         <w:spacing w:lineRule="auto" w:line="240" w:before="0" w:after="0"/>
-        <w:rPr/>
-      </w:pPr>
-      <w:r>
-        <w:rPr/>
+        <w:rPr>
+          <w:b w:val="false"/>
+          <w:bCs w:val="false"/>
+          <w:color w:val="000000"/>
+        </w:rPr>
+      </w:pPr>
+      <w:r>
+        <w:rPr>
+          <w:b w:val="false"/>
+          <w:bCs w:val="false"/>
+          <w:color w:val="000000"/>
+        </w:rPr>
       </w:r>
     </w:p>
     <w:p>
       <w:pPr>
         <w:pStyle w:val="Heading3"/>
         <w:spacing w:lineRule="auto" w:line="240" w:before="0" w:after="0"/>
-        <w:rPr/>
-      </w:pPr>
-      <w:r>
-        <w:rPr>
-          <w:outline w:val="false"/>
-          <w:color w:val="555555"/>
+        <w:rPr>
+          <w:color w:val="000000"/>
+        </w:rPr>
+      </w:pPr>
+      <w:r>
+        <w:rPr>
+          <w:outline w:val="false"/>
+          <w:color w:val="000000"/>
           <w:u w:val="none" w:color="555555"/>
           <w:lang w:val="en-US"/>
         </w:rPr>
@@ -20545,12 +20625,18 @@
       <w:pPr>
         <w:pStyle w:val="Heading3"/>
         <w:spacing w:lineRule="auto" w:line="240" w:before="0" w:after="0"/>
-        <w:rPr/>
-      </w:pPr>
-      <w:r>
-        <w:rPr>
-          <w:outline w:val="false"/>
-          <w:color w:val="1A1A1A"/>
+        <w:rPr>
+          <w:b w:val="false"/>
+          <w:bCs w:val="false"/>
+          <w:color w:val="000000"/>
+        </w:rPr>
+      </w:pPr>
+      <w:r>
+        <w:rPr>
+          <w:b w:val="false"/>
+          <w:bCs w:val="false"/>
+          <w:outline w:val="false"/>
+          <w:color w:val="000000"/>
           <w:u w:val="none" w:color="1A1A1A"/>
           <w:lang w:val="en-US"/>
         </w:rPr>
@@ -20561,22 +20647,32 @@
       <w:pPr>
         <w:pStyle w:val="Heading3"/>
         <w:spacing w:lineRule="auto" w:line="240" w:before="0" w:after="0"/>
-        <w:rPr/>
-      </w:pPr>
-      <w:r>
-        <w:rPr/>
+        <w:rPr>
+          <w:b w:val="false"/>
+          <w:bCs w:val="false"/>
+          <w:color w:val="000000"/>
+        </w:rPr>
+      </w:pPr>
+      <w:r>
+        <w:rPr>
+          <w:b w:val="false"/>
+          <w:bCs w:val="false"/>
+          <w:color w:val="000000"/>
+        </w:rPr>
       </w:r>
     </w:p>
     <w:p>
       <w:pPr>
         <w:pStyle w:val="Heading3"/>
         <w:spacing w:lineRule="auto" w:line="240" w:before="0" w:after="0"/>
-        <w:rPr/>
-      </w:pPr>
-      <w:r>
-        <w:rPr>
-          <w:outline w:val="false"/>
-          <w:color w:val="555555"/>
+        <w:rPr>
+          <w:color w:val="000000"/>
+        </w:rPr>
+      </w:pPr>
+      <w:r>
+        <w:rPr>
+          <w:outline w:val="false"/>
+          <w:color w:val="000000"/>
           <w:u w:val="none" w:color="555555"/>
           <w:lang w:val="en-US"/>
         </w:rPr>
@@ -20587,12 +20683,18 @@
       <w:pPr>
         <w:pStyle w:val="Heading3"/>
         <w:spacing w:lineRule="auto" w:line="240" w:before="0" w:after="0"/>
-        <w:rPr/>
-      </w:pPr>
-      <w:r>
-        <w:rPr>
-          <w:outline w:val="false"/>
-          <w:color w:val="1A1A1A"/>
+        <w:rPr>
+          <w:b w:val="false"/>
+          <w:bCs w:val="false"/>
+          <w:color w:val="000000"/>
+        </w:rPr>
+      </w:pPr>
+      <w:r>
+        <w:rPr>
+          <w:b w:val="false"/>
+          <w:bCs w:val="false"/>
+          <w:outline w:val="false"/>
+          <w:color w:val="000000"/>
           <w:u w:val="none" w:color="1A1A1A"/>
           <w:lang w:val="en-US"/>
         </w:rPr>
@@ -20603,13 +20705,19 @@
       <w:pPr>
         <w:pStyle w:val="Heading3"/>
         <w:spacing w:lineRule="auto" w:line="240" w:before="0" w:after="0"/>
-        <w:rPr/>
+        <w:rPr>
+          <w:b w:val="false"/>
+          <w:bCs w:val="false"/>
+          <w:color w:val="000000"/>
+        </w:rPr>
       </w:pPr>
       <w:r>
         <w:rPr>
           <w:rFonts w:ascii="Courier New" w:hAnsi="Courier New"/>
-          <w:outline w:val="false"/>
-          <w:color w:val="D4D4D4"/>
+          <w:b w:val="false"/>
+          <w:bCs w:val="false"/>
+          <w:outline w:val="false"/>
+          <w:color w:val="000000"/>
           <w:sz w:val="18"/>
           <w:szCs w:val="18"/>
           <w:u w:val="none" w:color="D4D4D4"/>
@@ -20622,13 +20730,19 @@
       <w:pPr>
         <w:pStyle w:val="Heading3"/>
         <w:spacing w:lineRule="auto" w:line="240" w:before="0" w:after="0"/>
-        <w:rPr/>
+        <w:rPr>
+          <w:b w:val="false"/>
+          <w:bCs w:val="false"/>
+          <w:color w:val="000000"/>
+        </w:rPr>
       </w:pPr>
       <w:r>
         <w:rPr>
           <w:rFonts w:ascii="Courier New" w:hAnsi="Courier New"/>
-          <w:outline w:val="false"/>
-          <w:color w:val="D4D4D4"/>
+          <w:b w:val="false"/>
+          <w:bCs w:val="false"/>
+          <w:outline w:val="false"/>
+          <w:color w:val="000000"/>
           <w:sz w:val="18"/>
           <w:szCs w:val="18"/>
           <w:u w:val="none" w:color="D4D4D4"/>
@@ -20641,13 +20755,19 @@
       <w:pPr>
         <w:pStyle w:val="Heading3"/>
         <w:spacing w:lineRule="auto" w:line="240" w:before="0" w:after="0"/>
-        <w:rPr/>
+        <w:rPr>
+          <w:b w:val="false"/>
+          <w:bCs w:val="false"/>
+          <w:color w:val="000000"/>
+        </w:rPr>
       </w:pPr>
       <w:r>
         <w:rPr>
           <w:rFonts w:ascii="Courier New" w:hAnsi="Courier New"/>
-          <w:outline w:val="false"/>
-          <w:color w:val="D4D4D4"/>
+          <w:b w:val="false"/>
+          <w:bCs w:val="false"/>
+          <w:outline w:val="false"/>
+          <w:color w:val="000000"/>
           <w:sz w:val="18"/>
           <w:szCs w:val="18"/>
           <w:u w:val="none" w:color="D4D4D4"/>
@@ -20657,8 +20777,10 @@
       <w:r>
         <w:rPr>
           <w:rFonts w:ascii="Courier New" w:hAnsi="Courier New"/>
-          <w:outline w:val="false"/>
-          <w:color w:val="D4D4D4"/>
+          <w:b w:val="false"/>
+          <w:bCs w:val="false"/>
+          <w:outline w:val="false"/>
+          <w:color w:val="000000"/>
           <w:sz w:val="18"/>
           <w:szCs w:val="18"/>
           <w:u w:val="none" w:color="D4D4D4"/>
@@ -20670,13 +20792,19 @@
       <w:pPr>
         <w:pStyle w:val="Heading3"/>
         <w:spacing w:lineRule="auto" w:line="240" w:before="0" w:after="0"/>
-        <w:rPr/>
+        <w:rPr>
+          <w:b w:val="false"/>
+          <w:bCs w:val="false"/>
+          <w:color w:val="000000"/>
+        </w:rPr>
       </w:pPr>
       <w:r>
         <w:rPr>
           <w:rFonts w:ascii="Courier New" w:hAnsi="Courier New"/>
-          <w:outline w:val="false"/>
-          <w:color w:val="D4D4D4"/>
+          <w:b w:val="false"/>
+          <w:bCs w:val="false"/>
+          <w:outline w:val="false"/>
+          <w:color w:val="000000"/>
           <w:sz w:val="18"/>
           <w:szCs w:val="18"/>
           <w:u w:val="none" w:color="D4D4D4"/>
@@ -20689,13 +20817,19 @@
       <w:pPr>
         <w:pStyle w:val="Heading3"/>
         <w:spacing w:lineRule="auto" w:line="240" w:before="0" w:after="0"/>
-        <w:rPr/>
+        <w:rPr>
+          <w:b w:val="false"/>
+          <w:bCs w:val="false"/>
+          <w:color w:val="000000"/>
+        </w:rPr>
       </w:pPr>
       <w:r>
         <w:rPr>
           <w:rFonts w:ascii="Courier New" w:hAnsi="Courier New"/>
-          <w:outline w:val="false"/>
-          <w:color w:val="D4D4D4"/>
+          <w:b w:val="false"/>
+          <w:bCs w:val="false"/>
+          <w:outline w:val="false"/>
+          <w:color w:val="000000"/>
           <w:sz w:val="18"/>
           <w:szCs w:val="18"/>
           <w:u w:val="none" w:color="D4D4D4"/>
@@ -20706,8 +20840,10 @@
       <w:r>
         <w:rPr>
           <w:rFonts w:ascii="Courier New" w:hAnsi="Courier New"/>
-          <w:outline w:val="false"/>
-          <w:color w:val="D4D4D4"/>
+          <w:b w:val="false"/>
+          <w:bCs w:val="false"/>
+          <w:outline w:val="false"/>
+          <w:color w:val="000000"/>
           <w:sz w:val="18"/>
           <w:szCs w:val="18"/>
           <w:u w:val="none" w:color="D4D4D4"/>
@@ -20720,13 +20856,19 @@
       <w:pPr>
         <w:pStyle w:val="Heading3"/>
         <w:spacing w:lineRule="auto" w:line="240" w:before="0" w:after="0"/>
-        <w:rPr/>
+        <w:rPr>
+          <w:b w:val="false"/>
+          <w:bCs w:val="false"/>
+          <w:color w:val="000000"/>
+        </w:rPr>
       </w:pPr>
       <w:r>
         <w:rPr>
           <w:rFonts w:ascii="Courier New" w:hAnsi="Courier New"/>
-          <w:outline w:val="false"/>
-          <w:color w:val="D4D4D4"/>
+          <w:b w:val="false"/>
+          <w:bCs w:val="false"/>
+          <w:outline w:val="false"/>
+          <w:color w:val="000000"/>
           <w:sz w:val="18"/>
           <w:szCs w:val="18"/>
           <w:u w:val="none" w:color="D4D4D4"/>
@@ -20737,8 +20879,10 @@
       <w:r>
         <w:rPr>
           <w:rFonts w:ascii="Courier New" w:hAnsi="Courier New"/>
-          <w:outline w:val="false"/>
-          <w:color w:val="D4D4D4"/>
+          <w:b w:val="false"/>
+          <w:bCs w:val="false"/>
+          <w:outline w:val="false"/>
+          <w:color w:val="000000"/>
           <w:sz w:val="18"/>
           <w:szCs w:val="18"/>
           <w:u w:val="none" w:color="D4D4D4"/>
@@ -20751,13 +20895,19 @@
       <w:pPr>
         <w:pStyle w:val="Heading3"/>
         <w:spacing w:lineRule="auto" w:line="240" w:before="0" w:after="0"/>
-        <w:rPr/>
+        <w:rPr>
+          <w:b w:val="false"/>
+          <w:bCs w:val="false"/>
+          <w:color w:val="000000"/>
+        </w:rPr>
       </w:pPr>
       <w:r>
         <w:rPr>
           <w:rFonts w:ascii="Courier New" w:hAnsi="Courier New"/>
-          <w:outline w:val="false"/>
-          <w:color w:val="D4D4D4"/>
+          <w:b w:val="false"/>
+          <w:bCs w:val="false"/>
+          <w:outline w:val="false"/>
+          <w:color w:val="000000"/>
           <w:sz w:val="18"/>
           <w:szCs w:val="18"/>
           <w:u w:val="none" w:color="D4D4D4"/>
@@ -20768,8 +20918,10 @@
       <w:r>
         <w:rPr>
           <w:rFonts w:ascii="Courier New" w:hAnsi="Courier New"/>
-          <w:outline w:val="false"/>
-          <w:color w:val="D4D4D4"/>
+          <w:b w:val="false"/>
+          <w:bCs w:val="false"/>
+          <w:outline w:val="false"/>
+          <w:color w:val="000000"/>
           <w:sz w:val="18"/>
           <w:szCs w:val="18"/>
           <w:u w:val="none" w:color="D4D4D4"/>
@@ -20782,13 +20934,19 @@
       <w:pPr>
         <w:pStyle w:val="Heading3"/>
         <w:spacing w:lineRule="auto" w:line="240" w:before="0" w:after="0"/>
-        <w:rPr/>
+        <w:rPr>
+          <w:b w:val="false"/>
+          <w:bCs w:val="false"/>
+          <w:color w:val="000000"/>
+        </w:rPr>
       </w:pPr>
       <w:r>
         <w:rPr>
           <w:rFonts w:ascii="Courier New" w:hAnsi="Courier New"/>
-          <w:outline w:val="false"/>
-          <w:color w:val="D4D4D4"/>
+          <w:b w:val="false"/>
+          <w:bCs w:val="false"/>
+          <w:outline w:val="false"/>
+          <w:color w:val="000000"/>
           <w:sz w:val="18"/>
           <w:szCs w:val="18"/>
           <w:u w:val="none" w:color="D4D4D4"/>
@@ -20799,8 +20957,10 @@
       <w:r>
         <w:rPr>
           <w:rFonts w:ascii="Courier New" w:hAnsi="Courier New"/>
-          <w:outline w:val="false"/>
-          <w:color w:val="D4D4D4"/>
+          <w:b w:val="false"/>
+          <w:bCs w:val="false"/>
+          <w:outline w:val="false"/>
+          <w:color w:val="000000"/>
           <w:sz w:val="18"/>
           <w:szCs w:val="18"/>
           <w:u w:val="none" w:color="D4D4D4"/>
@@ -20813,13 +20973,19 @@
       <w:pPr>
         <w:pStyle w:val="Heading3"/>
         <w:spacing w:lineRule="auto" w:line="240" w:before="0" w:after="0"/>
-        <w:rPr/>
+        <w:rPr>
+          <w:b w:val="false"/>
+          <w:bCs w:val="false"/>
+          <w:color w:val="000000"/>
+        </w:rPr>
       </w:pPr>
       <w:r>
         <w:rPr>
           <w:rFonts w:ascii="Courier New" w:hAnsi="Courier New"/>
-          <w:outline w:val="false"/>
-          <w:color w:val="D4D4D4"/>
+          <w:b w:val="false"/>
+          <w:bCs w:val="false"/>
+          <w:outline w:val="false"/>
+          <w:color w:val="000000"/>
           <w:sz w:val="18"/>
           <w:szCs w:val="18"/>
           <w:u w:val="none" w:color="D4D4D4"/>
@@ -20830,8 +20996,10 @@
       <w:r>
         <w:rPr>
           <w:rFonts w:ascii="Courier New" w:hAnsi="Courier New"/>
-          <w:outline w:val="false"/>
-          <w:color w:val="D4D4D4"/>
+          <w:b w:val="false"/>
+          <w:bCs w:val="false"/>
+          <w:outline w:val="false"/>
+          <w:color w:val="000000"/>
           <w:sz w:val="18"/>
           <w:szCs w:val="18"/>
           <w:u w:val="none" w:color="D4D4D4"/>
@@ -20844,13 +21012,19 @@
       <w:pPr>
         <w:pStyle w:val="Heading3"/>
         <w:spacing w:lineRule="auto" w:line="240" w:before="0" w:after="0"/>
-        <w:rPr/>
+        <w:rPr>
+          <w:b w:val="false"/>
+          <w:bCs w:val="false"/>
+          <w:color w:val="000000"/>
+        </w:rPr>
       </w:pPr>
       <w:r>
         <w:rPr>
           <w:rFonts w:ascii="Courier New" w:hAnsi="Courier New"/>
-          <w:outline w:val="false"/>
-          <w:color w:val="D4D4D4"/>
+          <w:b w:val="false"/>
+          <w:bCs w:val="false"/>
+          <w:outline w:val="false"/>
+          <w:color w:val="000000"/>
           <w:sz w:val="18"/>
           <w:szCs w:val="18"/>
           <w:u w:val="none" w:color="D4D4D4"/>
@@ -20863,10 +21037,16 @@
       <w:pPr>
         <w:pStyle w:val="Heading3"/>
         <w:spacing w:lineRule="auto" w:line="240" w:before="0" w:after="0"/>
-        <w:rPr/>
-      </w:pPr>
-      <w:r>
-        <w:rPr/>
+        <w:rPr>
+          <w:b w:val="false"/>
+          <w:bCs w:val="false"/>
+        </w:rPr>
+      </w:pPr>
+      <w:r>
+        <w:rPr>
+          <w:b w:val="false"/>
+          <w:bCs w:val="false"/>
+        </w:rPr>
       </w:r>
     </w:p>
     <w:p>
@@ -23602,7 +23782,7 @@
     </w:r>
     <w:r>
       <w:rPr/>
-      <w:t>0</w:t>
+      <w:t>19</w:t>
     </w:r>
     <w:r>
       <w:rPr/>
@@ -23657,7 +23837,7 @@
     </w:r>
     <w:r>
       <w:rPr/>
-      <w:t>0</w:t>
+      <w:t>19</w:t>
     </w:r>
     <w:r>
       <w:rPr/>

</xml_diff>

<commit_message>
Deploy 2026-04-07 12:59 — 8 file(s) updated
</commit_message>
<xml_diff>
--- a/Mohangraphy_Technical_Guide.docx
+++ b/Mohangraphy_Technical_Guide.docx
@@ -927,8 +927,8 @@
         </w:tblCellMar>
       </w:tblPr>
       <w:tblGrid>
-        <w:gridCol w:w="3598"/>
-        <w:gridCol w:w="5762"/>
+        <w:gridCol w:w="3597"/>
+        <w:gridCol w:w="5763"/>
       </w:tblGrid>
       <w:tr>
         <w:trPr>
@@ -937,7 +937,7 @@
         </w:trPr>
         <w:tc>
           <w:tcPr>
-            <w:tcW w:w="3598" w:type="dxa"/>
+            <w:tcW w:w="3597" w:type="dxa"/>
             <w:tcBorders>
               <w:top w:val="single" w:sz="2" w:space="0" w:color="DDDDDD"/>
               <w:start w:val="single" w:sz="2" w:space="0" w:color="DDDDDD"/>
@@ -981,7 +981,7 @@
         </w:tc>
         <w:tc>
           <w:tcPr>
-            <w:tcW w:w="5762" w:type="dxa"/>
+            <w:tcW w:w="5763" w:type="dxa"/>
             <w:tcBorders>
               <w:top w:val="single" w:sz="2" w:space="0" w:color="DDDDDD"/>
               <w:start w:val="single" w:sz="2" w:space="0" w:color="DDDDDD"/>
@@ -1030,7 +1030,7 @@
         </w:trPr>
         <w:tc>
           <w:tcPr>
-            <w:tcW w:w="3598" w:type="dxa"/>
+            <w:tcW w:w="3597" w:type="dxa"/>
             <w:tcBorders>
               <w:top w:val="single" w:sz="2" w:space="0" w:color="DDDDDD"/>
               <w:start w:val="single" w:sz="2" w:space="0" w:color="DDDDDD"/>
@@ -1074,7 +1074,7 @@
         </w:tc>
         <w:tc>
           <w:tcPr>
-            <w:tcW w:w="5762" w:type="dxa"/>
+            <w:tcW w:w="5763" w:type="dxa"/>
             <w:tcBorders>
               <w:top w:val="single" w:sz="2" w:space="0" w:color="DDDDDD"/>
               <w:start w:val="single" w:sz="2" w:space="0" w:color="DDDDDD"/>
@@ -1124,7 +1124,7 @@
         </w:trPr>
         <w:tc>
           <w:tcPr>
-            <w:tcW w:w="3598" w:type="dxa"/>
+            <w:tcW w:w="3597" w:type="dxa"/>
             <w:tcBorders>
               <w:top w:val="single" w:sz="2" w:space="0" w:color="DDDDDD"/>
               <w:start w:val="single" w:sz="2" w:space="0" w:color="DDDDDD"/>
@@ -1168,7 +1168,7 @@
         </w:tc>
         <w:tc>
           <w:tcPr>
-            <w:tcW w:w="5762" w:type="dxa"/>
+            <w:tcW w:w="5763" w:type="dxa"/>
             <w:tcBorders>
               <w:top w:val="single" w:sz="2" w:space="0" w:color="DDDDDD"/>
               <w:start w:val="single" w:sz="2" w:space="0" w:color="DDDDDD"/>
@@ -1218,7 +1218,7 @@
         </w:trPr>
         <w:tc>
           <w:tcPr>
-            <w:tcW w:w="3598" w:type="dxa"/>
+            <w:tcW w:w="3597" w:type="dxa"/>
             <w:tcBorders>
               <w:top w:val="single" w:sz="2" w:space="0" w:color="DDDDDD"/>
               <w:start w:val="single" w:sz="2" w:space="0" w:color="DDDDDD"/>
@@ -1262,7 +1262,7 @@
         </w:tc>
         <w:tc>
           <w:tcPr>
-            <w:tcW w:w="5762" w:type="dxa"/>
+            <w:tcW w:w="5763" w:type="dxa"/>
             <w:tcBorders>
               <w:top w:val="single" w:sz="2" w:space="0" w:color="DDDDDD"/>
               <w:start w:val="single" w:sz="2" w:space="0" w:color="DDDDDD"/>
@@ -1325,7 +1325,7 @@
         </w:trPr>
         <w:tc>
           <w:tcPr>
-            <w:tcW w:w="3598" w:type="dxa"/>
+            <w:tcW w:w="3597" w:type="dxa"/>
             <w:tcBorders>
               <w:top w:val="single" w:sz="2" w:space="0" w:color="DDDDDD"/>
               <w:start w:val="single" w:sz="2" w:space="0" w:color="DDDDDD"/>
@@ -1369,7 +1369,7 @@
         </w:tc>
         <w:tc>
           <w:tcPr>
-            <w:tcW w:w="5762" w:type="dxa"/>
+            <w:tcW w:w="5763" w:type="dxa"/>
             <w:tcBorders>
               <w:top w:val="single" w:sz="2" w:space="0" w:color="DDDDDD"/>
               <w:start w:val="single" w:sz="2" w:space="0" w:color="DDDDDD"/>
@@ -1432,7 +1432,7 @@
         </w:trPr>
         <w:tc>
           <w:tcPr>
-            <w:tcW w:w="3598" w:type="dxa"/>
+            <w:tcW w:w="3597" w:type="dxa"/>
             <w:tcBorders>
               <w:top w:val="single" w:sz="2" w:space="0" w:color="DDDDDD"/>
               <w:start w:val="single" w:sz="2" w:space="0" w:color="DDDDDD"/>
@@ -1475,7 +1475,7 @@
         </w:tc>
         <w:tc>
           <w:tcPr>
-            <w:tcW w:w="5762" w:type="dxa"/>
+            <w:tcW w:w="5763" w:type="dxa"/>
             <w:tcBorders>
               <w:top w:val="single" w:sz="2" w:space="0" w:color="DDDDDD"/>
               <w:start w:val="single" w:sz="2" w:space="0" w:color="DDDDDD"/>
@@ -1524,7 +1524,7 @@
         </w:trPr>
         <w:tc>
           <w:tcPr>
-            <w:tcW w:w="3598" w:type="dxa"/>
+            <w:tcW w:w="3597" w:type="dxa"/>
             <w:tcBorders>
               <w:top w:val="single" w:sz="2" w:space="0" w:color="DDDDDD"/>
               <w:start w:val="single" w:sz="2" w:space="0" w:color="DDDDDD"/>
@@ -1568,7 +1568,7 @@
         </w:tc>
         <w:tc>
           <w:tcPr>
-            <w:tcW w:w="5762" w:type="dxa"/>
+            <w:tcW w:w="5763" w:type="dxa"/>
             <w:tcBorders>
               <w:top w:val="single" w:sz="2" w:space="0" w:color="DDDDDD"/>
               <w:start w:val="single" w:sz="2" w:space="0" w:color="DDDDDD"/>
@@ -1618,7 +1618,7 @@
         </w:trPr>
         <w:tc>
           <w:tcPr>
-            <w:tcW w:w="3598" w:type="dxa"/>
+            <w:tcW w:w="3597" w:type="dxa"/>
             <w:tcBorders>
               <w:top w:val="single" w:sz="2" w:space="0" w:color="DDDDDD"/>
               <w:start w:val="single" w:sz="2" w:space="0" w:color="DDDDDD"/>
@@ -1662,7 +1662,7 @@
         </w:tc>
         <w:tc>
           <w:tcPr>
-            <w:tcW w:w="5762" w:type="dxa"/>
+            <w:tcW w:w="5763" w:type="dxa"/>
             <w:tcBorders>
               <w:top w:val="single" w:sz="2" w:space="0" w:color="DDDDDD"/>
               <w:start w:val="single" w:sz="2" w:space="0" w:color="DDDDDD"/>
@@ -1724,7 +1724,7 @@
         </w:trPr>
         <w:tc>
           <w:tcPr>
-            <w:tcW w:w="3598" w:type="dxa"/>
+            <w:tcW w:w="3597" w:type="dxa"/>
             <w:tcBorders>
               <w:top w:val="single" w:sz="2" w:space="0" w:color="DDDDDD"/>
               <w:start w:val="single" w:sz="2" w:space="0" w:color="DDDDDD"/>
@@ -1768,7 +1768,7 @@
         </w:tc>
         <w:tc>
           <w:tcPr>
-            <w:tcW w:w="5762" w:type="dxa"/>
+            <w:tcW w:w="5763" w:type="dxa"/>
             <w:tcBorders>
               <w:top w:val="single" w:sz="2" w:space="0" w:color="DDDDDD"/>
               <w:start w:val="single" w:sz="2" w:space="0" w:color="DDDDDD"/>
@@ -1878,8 +1878,8 @@
         </w:tblCellMar>
       </w:tblPr>
       <w:tblGrid>
-        <w:gridCol w:w="3598"/>
-        <w:gridCol w:w="5762"/>
+        <w:gridCol w:w="3597"/>
+        <w:gridCol w:w="5763"/>
       </w:tblGrid>
       <w:tr>
         <w:trPr>
@@ -1888,7 +1888,7 @@
         </w:trPr>
         <w:tc>
           <w:tcPr>
-            <w:tcW w:w="3598" w:type="dxa"/>
+            <w:tcW w:w="3597" w:type="dxa"/>
             <w:tcBorders>
               <w:top w:val="single" w:sz="2" w:space="0" w:color="DDDDDD"/>
               <w:start w:val="single" w:sz="2" w:space="0" w:color="DDDDDD"/>
@@ -1931,7 +1931,7 @@
         </w:tc>
         <w:tc>
           <w:tcPr>
-            <w:tcW w:w="5762" w:type="dxa"/>
+            <w:tcW w:w="5763" w:type="dxa"/>
             <w:tcBorders>
               <w:top w:val="single" w:sz="2" w:space="0" w:color="DDDDDD"/>
               <w:start w:val="single" w:sz="2" w:space="0" w:color="DDDDDD"/>
@@ -1981,7 +1981,7 @@
         </w:trPr>
         <w:tc>
           <w:tcPr>
-            <w:tcW w:w="3598" w:type="dxa"/>
+            <w:tcW w:w="3597" w:type="dxa"/>
             <w:tcBorders>
               <w:top w:val="single" w:sz="2" w:space="0" w:color="DDDDDD"/>
               <w:start w:val="single" w:sz="2" w:space="0" w:color="DDDDDD"/>
@@ -2025,7 +2025,7 @@
         </w:tc>
         <w:tc>
           <w:tcPr>
-            <w:tcW w:w="5762" w:type="dxa"/>
+            <w:tcW w:w="5763" w:type="dxa"/>
             <w:tcBorders>
               <w:top w:val="single" w:sz="2" w:space="0" w:color="DDDDDD"/>
               <w:start w:val="single" w:sz="2" w:space="0" w:color="DDDDDD"/>
@@ -2075,7 +2075,7 @@
         </w:trPr>
         <w:tc>
           <w:tcPr>
-            <w:tcW w:w="3598" w:type="dxa"/>
+            <w:tcW w:w="3597" w:type="dxa"/>
             <w:tcBorders>
               <w:top w:val="single" w:sz="2" w:space="0" w:color="DDDDDD"/>
               <w:start w:val="single" w:sz="2" w:space="0" w:color="DDDDDD"/>
@@ -2118,7 +2118,7 @@
         </w:tc>
         <w:tc>
           <w:tcPr>
-            <w:tcW w:w="5762" w:type="dxa"/>
+            <w:tcW w:w="5763" w:type="dxa"/>
             <w:tcBorders>
               <w:top w:val="single" w:sz="2" w:space="0" w:color="DDDDDD"/>
               <w:start w:val="single" w:sz="2" w:space="0" w:color="DDDDDD"/>
@@ -2168,7 +2168,7 @@
         </w:trPr>
         <w:tc>
           <w:tcPr>
-            <w:tcW w:w="3598" w:type="dxa"/>
+            <w:tcW w:w="3597" w:type="dxa"/>
             <w:tcBorders>
               <w:top w:val="single" w:sz="2" w:space="0" w:color="DDDDDD"/>
               <w:start w:val="single" w:sz="2" w:space="0" w:color="DDDDDD"/>
@@ -2212,7 +2212,7 @@
         </w:tc>
         <w:tc>
           <w:tcPr>
-            <w:tcW w:w="5762" w:type="dxa"/>
+            <w:tcW w:w="5763" w:type="dxa"/>
             <w:tcBorders>
               <w:top w:val="single" w:sz="2" w:space="0" w:color="DDDDDD"/>
               <w:start w:val="single" w:sz="2" w:space="0" w:color="DDDDDD"/>
@@ -2262,7 +2262,7 @@
         </w:trPr>
         <w:tc>
           <w:tcPr>
-            <w:tcW w:w="3598" w:type="dxa"/>
+            <w:tcW w:w="3597" w:type="dxa"/>
             <w:tcBorders>
               <w:top w:val="single" w:sz="2" w:space="0" w:color="DDDDDD"/>
               <w:start w:val="single" w:sz="2" w:space="0" w:color="DDDDDD"/>
@@ -2306,7 +2306,7 @@
         </w:tc>
         <w:tc>
           <w:tcPr>
-            <w:tcW w:w="5762" w:type="dxa"/>
+            <w:tcW w:w="5763" w:type="dxa"/>
             <w:tcBorders>
               <w:top w:val="single" w:sz="2" w:space="0" w:color="DDDDDD"/>
               <w:start w:val="single" w:sz="2" w:space="0" w:color="DDDDDD"/>
@@ -2356,7 +2356,7 @@
         </w:trPr>
         <w:tc>
           <w:tcPr>
-            <w:tcW w:w="3598" w:type="dxa"/>
+            <w:tcW w:w="3597" w:type="dxa"/>
             <w:tcBorders>
               <w:top w:val="single" w:sz="2" w:space="0" w:color="DDDDDD"/>
               <w:start w:val="single" w:sz="2" w:space="0" w:color="DDDDDD"/>
@@ -2400,7 +2400,7 @@
         </w:tc>
         <w:tc>
           <w:tcPr>
-            <w:tcW w:w="5762" w:type="dxa"/>
+            <w:tcW w:w="5763" w:type="dxa"/>
             <w:tcBorders>
               <w:top w:val="single" w:sz="2" w:space="0" w:color="DDDDDD"/>
               <w:start w:val="single" w:sz="2" w:space="0" w:color="DDDDDD"/>
@@ -2450,7 +2450,7 @@
         </w:trPr>
         <w:tc>
           <w:tcPr>
-            <w:tcW w:w="3598" w:type="dxa"/>
+            <w:tcW w:w="3597" w:type="dxa"/>
             <w:tcBorders>
               <w:top w:val="single" w:sz="2" w:space="0" w:color="DDDDDD"/>
               <w:start w:val="single" w:sz="2" w:space="0" w:color="DDDDDD"/>
@@ -2494,7 +2494,7 @@
         </w:tc>
         <w:tc>
           <w:tcPr>
-            <w:tcW w:w="5762" w:type="dxa"/>
+            <w:tcW w:w="5763" w:type="dxa"/>
             <w:tcBorders>
               <w:top w:val="single" w:sz="2" w:space="0" w:color="DDDDDD"/>
               <w:start w:val="single" w:sz="2" w:space="0" w:color="DDDDDD"/>
@@ -2544,7 +2544,7 @@
         </w:trPr>
         <w:tc>
           <w:tcPr>
-            <w:tcW w:w="3598" w:type="dxa"/>
+            <w:tcW w:w="3597" w:type="dxa"/>
             <w:tcBorders>
               <w:top w:val="single" w:sz="2" w:space="0" w:color="DDDDDD"/>
               <w:start w:val="single" w:sz="2" w:space="0" w:color="DDDDDD"/>
@@ -2588,7 +2588,7 @@
         </w:tc>
         <w:tc>
           <w:tcPr>
-            <w:tcW w:w="5762" w:type="dxa"/>
+            <w:tcW w:w="5763" w:type="dxa"/>
             <w:tcBorders>
               <w:top w:val="single" w:sz="2" w:space="0" w:color="DDDDDD"/>
               <w:start w:val="single" w:sz="2" w:space="0" w:color="DDDDDD"/>
@@ -2638,7 +2638,7 @@
         </w:trPr>
         <w:tc>
           <w:tcPr>
-            <w:tcW w:w="3598" w:type="dxa"/>
+            <w:tcW w:w="3597" w:type="dxa"/>
             <w:tcBorders>
               <w:top w:val="single" w:sz="2" w:space="0" w:color="DDDDDD"/>
               <w:start w:val="single" w:sz="2" w:space="0" w:color="DDDDDD"/>
@@ -2682,7 +2682,7 @@
         </w:tc>
         <w:tc>
           <w:tcPr>
-            <w:tcW w:w="5762" w:type="dxa"/>
+            <w:tcW w:w="5763" w:type="dxa"/>
             <w:tcBorders>
               <w:top w:val="single" w:sz="2" w:space="0" w:color="DDDDDD"/>
               <w:start w:val="single" w:sz="2" w:space="0" w:color="DDDDDD"/>
@@ -2732,7 +2732,7 @@
         </w:trPr>
         <w:tc>
           <w:tcPr>
-            <w:tcW w:w="3598" w:type="dxa"/>
+            <w:tcW w:w="3597" w:type="dxa"/>
             <w:tcBorders>
               <w:top w:val="single" w:sz="2" w:space="0" w:color="DDDDDD"/>
               <w:start w:val="single" w:sz="2" w:space="0" w:color="DDDDDD"/>
@@ -2776,7 +2776,7 @@
         </w:tc>
         <w:tc>
           <w:tcPr>
-            <w:tcW w:w="5762" w:type="dxa"/>
+            <w:tcW w:w="5763" w:type="dxa"/>
             <w:tcBorders>
               <w:top w:val="single" w:sz="2" w:space="0" w:color="DDDDDD"/>
               <w:start w:val="single" w:sz="2" w:space="0" w:color="DDDDDD"/>
@@ -2826,7 +2826,7 @@
         </w:trPr>
         <w:tc>
           <w:tcPr>
-            <w:tcW w:w="3598" w:type="dxa"/>
+            <w:tcW w:w="3597" w:type="dxa"/>
             <w:tcBorders>
               <w:top w:val="single" w:sz="2" w:space="0" w:color="DDDDDD"/>
               <w:start w:val="single" w:sz="2" w:space="0" w:color="DDDDDD"/>
@@ -2869,7 +2869,7 @@
         </w:tc>
         <w:tc>
           <w:tcPr>
-            <w:tcW w:w="5762" w:type="dxa"/>
+            <w:tcW w:w="5763" w:type="dxa"/>
             <w:tcBorders>
               <w:top w:val="single" w:sz="2" w:space="0" w:color="DDDDDD"/>
               <w:start w:val="single" w:sz="2" w:space="0" w:color="DDDDDD"/>
@@ -2919,7 +2919,7 @@
         </w:trPr>
         <w:tc>
           <w:tcPr>
-            <w:tcW w:w="3598" w:type="dxa"/>
+            <w:tcW w:w="3597" w:type="dxa"/>
             <w:tcBorders>
               <w:top w:val="single" w:sz="2" w:space="0" w:color="DDDDDD"/>
               <w:start w:val="single" w:sz="2" w:space="0" w:color="DDDDDD"/>
@@ -2963,7 +2963,7 @@
         </w:tc>
         <w:tc>
           <w:tcPr>
-            <w:tcW w:w="5762" w:type="dxa"/>
+            <w:tcW w:w="5763" w:type="dxa"/>
             <w:tcBorders>
               <w:top w:val="single" w:sz="2" w:space="0" w:color="DDDDDD"/>
               <w:start w:val="single" w:sz="2" w:space="0" w:color="DDDDDD"/>
@@ -5185,8 +5185,8 @@
         </w:tblCellMar>
       </w:tblPr>
       <w:tblGrid>
-        <w:gridCol w:w="3598"/>
-        <w:gridCol w:w="5762"/>
+        <w:gridCol w:w="3597"/>
+        <w:gridCol w:w="5763"/>
       </w:tblGrid>
       <w:tr>
         <w:trPr>
@@ -5195,7 +5195,7 @@
         </w:trPr>
         <w:tc>
           <w:tcPr>
-            <w:tcW w:w="3598" w:type="dxa"/>
+            <w:tcW w:w="3597" w:type="dxa"/>
             <w:tcBorders>
               <w:top w:val="single" w:sz="2" w:space="0" w:color="DDDDDD"/>
               <w:start w:val="single" w:sz="2" w:space="0" w:color="DDDDDD"/>
@@ -5239,7 +5239,7 @@
         </w:tc>
         <w:tc>
           <w:tcPr>
-            <w:tcW w:w="5762" w:type="dxa"/>
+            <w:tcW w:w="5763" w:type="dxa"/>
             <w:tcBorders>
               <w:top w:val="single" w:sz="2" w:space="0" w:color="DDDDDD"/>
               <w:start w:val="single" w:sz="2" w:space="0" w:color="DDDDDD"/>
@@ -5288,7 +5288,7 @@
         </w:trPr>
         <w:tc>
           <w:tcPr>
-            <w:tcW w:w="3598" w:type="dxa"/>
+            <w:tcW w:w="3597" w:type="dxa"/>
             <w:tcBorders>
               <w:top w:val="single" w:sz="2" w:space="0" w:color="DDDDDD"/>
               <w:start w:val="single" w:sz="2" w:space="0" w:color="DDDDDD"/>
@@ -5332,7 +5332,7 @@
         </w:tc>
         <w:tc>
           <w:tcPr>
-            <w:tcW w:w="5762" w:type="dxa"/>
+            <w:tcW w:w="5763" w:type="dxa"/>
             <w:tcBorders>
               <w:top w:val="single" w:sz="2" w:space="0" w:color="DDDDDD"/>
               <w:start w:val="single" w:sz="2" w:space="0" w:color="DDDDDD"/>
@@ -5423,7 +5423,7 @@
         </w:trPr>
         <w:tc>
           <w:tcPr>
-            <w:tcW w:w="3598" w:type="dxa"/>
+            <w:tcW w:w="3597" w:type="dxa"/>
             <w:tcBorders>
               <w:top w:val="single" w:sz="2" w:space="0" w:color="DDDDDD"/>
               <w:start w:val="single" w:sz="2" w:space="0" w:color="DDDDDD"/>
@@ -5467,7 +5467,7 @@
         </w:tc>
         <w:tc>
           <w:tcPr>
-            <w:tcW w:w="5762" w:type="dxa"/>
+            <w:tcW w:w="5763" w:type="dxa"/>
             <w:tcBorders>
               <w:top w:val="single" w:sz="2" w:space="0" w:color="DDDDDD"/>
               <w:start w:val="single" w:sz="2" w:space="0" w:color="DDDDDD"/>
@@ -5546,7 +5546,7 @@
         </w:trPr>
         <w:tc>
           <w:tcPr>
-            <w:tcW w:w="3598" w:type="dxa"/>
+            <w:tcW w:w="3597" w:type="dxa"/>
             <w:tcBorders>
               <w:top w:val="single" w:sz="2" w:space="0" w:color="DDDDDD"/>
               <w:start w:val="single" w:sz="2" w:space="0" w:color="DDDDDD"/>
@@ -5590,7 +5590,7 @@
         </w:tc>
         <w:tc>
           <w:tcPr>
-            <w:tcW w:w="5762" w:type="dxa"/>
+            <w:tcW w:w="5763" w:type="dxa"/>
             <w:tcBorders>
               <w:top w:val="single" w:sz="2" w:space="0" w:color="DDDDDD"/>
               <w:start w:val="single" w:sz="2" w:space="0" w:color="DDDDDD"/>
@@ -5681,7 +5681,7 @@
         </w:trPr>
         <w:tc>
           <w:tcPr>
-            <w:tcW w:w="3598" w:type="dxa"/>
+            <w:tcW w:w="3597" w:type="dxa"/>
             <w:tcBorders>
               <w:top w:val="single" w:sz="2" w:space="0" w:color="DDDDDD"/>
               <w:start w:val="single" w:sz="2" w:space="0" w:color="DDDDDD"/>
@@ -5725,7 +5725,7 @@
         </w:tc>
         <w:tc>
           <w:tcPr>
-            <w:tcW w:w="5762" w:type="dxa"/>
+            <w:tcW w:w="5763" w:type="dxa"/>
             <w:tcBorders>
               <w:top w:val="single" w:sz="2" w:space="0" w:color="DDDDDD"/>
               <w:start w:val="single" w:sz="2" w:space="0" w:color="DDDDDD"/>
@@ -6047,8 +6047,8 @@
         </w:tblCellMar>
       </w:tblPr>
       <w:tblGrid>
-        <w:gridCol w:w="3598"/>
-        <w:gridCol w:w="5762"/>
+        <w:gridCol w:w="3597"/>
+        <w:gridCol w:w="5763"/>
       </w:tblGrid>
       <w:tr>
         <w:trPr>
@@ -6057,7 +6057,7 @@
         </w:trPr>
         <w:tc>
           <w:tcPr>
-            <w:tcW w:w="3598" w:type="dxa"/>
+            <w:tcW w:w="3597" w:type="dxa"/>
             <w:tcBorders>
               <w:top w:val="single" w:sz="2" w:space="0" w:color="DDDDDD"/>
               <w:start w:val="single" w:sz="2" w:space="0" w:color="DDDDDD"/>
@@ -6101,7 +6101,7 @@
         </w:tc>
         <w:tc>
           <w:tcPr>
-            <w:tcW w:w="5762" w:type="dxa"/>
+            <w:tcW w:w="5763" w:type="dxa"/>
             <w:tcBorders>
               <w:top w:val="single" w:sz="2" w:space="0" w:color="DDDDDD"/>
               <w:start w:val="single" w:sz="2" w:space="0" w:color="DDDDDD"/>
@@ -6151,7 +6151,7 @@
         </w:trPr>
         <w:tc>
           <w:tcPr>
-            <w:tcW w:w="3598" w:type="dxa"/>
+            <w:tcW w:w="3597" w:type="dxa"/>
             <w:tcBorders>
               <w:top w:val="single" w:sz="2" w:space="0" w:color="DDDDDD"/>
               <w:start w:val="single" w:sz="2" w:space="0" w:color="DDDDDD"/>
@@ -6195,7 +6195,7 @@
         </w:tc>
         <w:tc>
           <w:tcPr>
-            <w:tcW w:w="5762" w:type="dxa"/>
+            <w:tcW w:w="5763" w:type="dxa"/>
             <w:tcBorders>
               <w:top w:val="single" w:sz="2" w:space="0" w:color="DDDDDD"/>
               <w:start w:val="single" w:sz="2" w:space="0" w:color="DDDDDD"/>
@@ -6245,7 +6245,7 @@
         </w:trPr>
         <w:tc>
           <w:tcPr>
-            <w:tcW w:w="3598" w:type="dxa"/>
+            <w:tcW w:w="3597" w:type="dxa"/>
             <w:tcBorders>
               <w:top w:val="single" w:sz="2" w:space="0" w:color="DDDDDD"/>
               <w:start w:val="single" w:sz="2" w:space="0" w:color="DDDDDD"/>
@@ -6289,7 +6289,7 @@
         </w:tc>
         <w:tc>
           <w:tcPr>
-            <w:tcW w:w="5762" w:type="dxa"/>
+            <w:tcW w:w="5763" w:type="dxa"/>
             <w:tcBorders>
               <w:top w:val="single" w:sz="2" w:space="0" w:color="DDDDDD"/>
               <w:start w:val="single" w:sz="2" w:space="0" w:color="DDDDDD"/>
@@ -6339,7 +6339,7 @@
         </w:trPr>
         <w:tc>
           <w:tcPr>
-            <w:tcW w:w="3598" w:type="dxa"/>
+            <w:tcW w:w="3597" w:type="dxa"/>
             <w:tcBorders>
               <w:top w:val="single" w:sz="2" w:space="0" w:color="DDDDDD"/>
               <w:start w:val="single" w:sz="2" w:space="0" w:color="DDDDDD"/>
@@ -6383,7 +6383,7 @@
         </w:tc>
         <w:tc>
           <w:tcPr>
-            <w:tcW w:w="5762" w:type="dxa"/>
+            <w:tcW w:w="5763" w:type="dxa"/>
             <w:tcBorders>
               <w:top w:val="single" w:sz="2" w:space="0" w:color="DDDDDD"/>
               <w:start w:val="single" w:sz="2" w:space="0" w:color="DDDDDD"/>
@@ -6433,7 +6433,7 @@
         </w:trPr>
         <w:tc>
           <w:tcPr>
-            <w:tcW w:w="3598" w:type="dxa"/>
+            <w:tcW w:w="3597" w:type="dxa"/>
             <w:tcBorders>
               <w:top w:val="single" w:sz="2" w:space="0" w:color="DDDDDD"/>
               <w:start w:val="single" w:sz="2" w:space="0" w:color="DDDDDD"/>
@@ -6476,7 +6476,7 @@
         </w:tc>
         <w:tc>
           <w:tcPr>
-            <w:tcW w:w="5762" w:type="dxa"/>
+            <w:tcW w:w="5763" w:type="dxa"/>
             <w:tcBorders>
               <w:top w:val="single" w:sz="2" w:space="0" w:color="DDDDDD"/>
               <w:start w:val="single" w:sz="2" w:space="0" w:color="DDDDDD"/>
@@ -6526,7 +6526,7 @@
         </w:trPr>
         <w:tc>
           <w:tcPr>
-            <w:tcW w:w="3598" w:type="dxa"/>
+            <w:tcW w:w="3597" w:type="dxa"/>
             <w:tcBorders>
               <w:top w:val="single" w:sz="2" w:space="0" w:color="DDDDDD"/>
               <w:start w:val="single" w:sz="2" w:space="0" w:color="DDDDDD"/>
@@ -6570,7 +6570,7 @@
         </w:tc>
         <w:tc>
           <w:tcPr>
-            <w:tcW w:w="5762" w:type="dxa"/>
+            <w:tcW w:w="5763" w:type="dxa"/>
             <w:tcBorders>
               <w:top w:val="single" w:sz="2" w:space="0" w:color="DDDDDD"/>
               <w:start w:val="single" w:sz="2" w:space="0" w:color="DDDDDD"/>
@@ -6620,7 +6620,7 @@
         </w:trPr>
         <w:tc>
           <w:tcPr>
-            <w:tcW w:w="3598" w:type="dxa"/>
+            <w:tcW w:w="3597" w:type="dxa"/>
             <w:tcBorders>
               <w:top w:val="single" w:sz="2" w:space="0" w:color="DDDDDD"/>
               <w:start w:val="single" w:sz="2" w:space="0" w:color="DDDDDD"/>
@@ -6664,7 +6664,7 @@
         </w:tc>
         <w:tc>
           <w:tcPr>
-            <w:tcW w:w="5762" w:type="dxa"/>
+            <w:tcW w:w="5763" w:type="dxa"/>
             <w:tcBorders>
               <w:top w:val="single" w:sz="2" w:space="0" w:color="DDDDDD"/>
               <w:start w:val="single" w:sz="2" w:space="0" w:color="DDDDDD"/>
@@ -6714,7 +6714,7 @@
         </w:trPr>
         <w:tc>
           <w:tcPr>
-            <w:tcW w:w="3598" w:type="dxa"/>
+            <w:tcW w:w="3597" w:type="dxa"/>
             <w:tcBorders>
               <w:top w:val="single" w:sz="2" w:space="0" w:color="DDDDDD"/>
               <w:start w:val="single" w:sz="2" w:space="0" w:color="DDDDDD"/>
@@ -6758,7 +6758,7 @@
         </w:tc>
         <w:tc>
           <w:tcPr>
-            <w:tcW w:w="5762" w:type="dxa"/>
+            <w:tcW w:w="5763" w:type="dxa"/>
             <w:tcBorders>
               <w:top w:val="single" w:sz="2" w:space="0" w:color="DDDDDD"/>
               <w:start w:val="single" w:sz="2" w:space="0" w:color="DDDDDD"/>
@@ -6808,7 +6808,7 @@
         </w:trPr>
         <w:tc>
           <w:tcPr>
-            <w:tcW w:w="3598" w:type="dxa"/>
+            <w:tcW w:w="3597" w:type="dxa"/>
             <w:tcBorders>
               <w:top w:val="single" w:sz="2" w:space="0" w:color="DDDDDD"/>
               <w:start w:val="single" w:sz="2" w:space="0" w:color="DDDDDD"/>
@@ -6852,7 +6852,7 @@
         </w:tc>
         <w:tc>
           <w:tcPr>
-            <w:tcW w:w="5762" w:type="dxa"/>
+            <w:tcW w:w="5763" w:type="dxa"/>
             <w:tcBorders>
               <w:top w:val="single" w:sz="2" w:space="0" w:color="DDDDDD"/>
               <w:start w:val="single" w:sz="2" w:space="0" w:color="DDDDDD"/>
@@ -6949,8 +6949,8 @@
         </w:tblCellMar>
       </w:tblPr>
       <w:tblGrid>
-        <w:gridCol w:w="3598"/>
-        <w:gridCol w:w="5762"/>
+        <w:gridCol w:w="3597"/>
+        <w:gridCol w:w="5763"/>
       </w:tblGrid>
       <w:tr>
         <w:trPr>
@@ -6959,7 +6959,7 @@
         </w:trPr>
         <w:tc>
           <w:tcPr>
-            <w:tcW w:w="3598" w:type="dxa"/>
+            <w:tcW w:w="3597" w:type="dxa"/>
             <w:tcBorders>
               <w:top w:val="single" w:sz="2" w:space="0" w:color="DDDDDD"/>
               <w:start w:val="single" w:sz="2" w:space="0" w:color="DDDDDD"/>
@@ -7002,7 +7002,7 @@
         </w:tc>
         <w:tc>
           <w:tcPr>
-            <w:tcW w:w="5762" w:type="dxa"/>
+            <w:tcW w:w="5763" w:type="dxa"/>
             <w:tcBorders>
               <w:top w:val="single" w:sz="2" w:space="0" w:color="DDDDDD"/>
               <w:start w:val="single" w:sz="2" w:space="0" w:color="DDDDDD"/>
@@ -7052,7 +7052,7 @@
         </w:trPr>
         <w:tc>
           <w:tcPr>
-            <w:tcW w:w="3598" w:type="dxa"/>
+            <w:tcW w:w="3597" w:type="dxa"/>
             <w:tcBorders>
               <w:top w:val="single" w:sz="2" w:space="0" w:color="DDDDDD"/>
               <w:start w:val="single" w:sz="2" w:space="0" w:color="DDDDDD"/>
@@ -7095,7 +7095,7 @@
         </w:tc>
         <w:tc>
           <w:tcPr>
-            <w:tcW w:w="5762" w:type="dxa"/>
+            <w:tcW w:w="5763" w:type="dxa"/>
             <w:tcBorders>
               <w:top w:val="single" w:sz="2" w:space="0" w:color="DDDDDD"/>
               <w:start w:val="single" w:sz="2" w:space="0" w:color="DDDDDD"/>
@@ -7145,7 +7145,7 @@
         </w:trPr>
         <w:tc>
           <w:tcPr>
-            <w:tcW w:w="3598" w:type="dxa"/>
+            <w:tcW w:w="3597" w:type="dxa"/>
             <w:tcBorders>
               <w:top w:val="single" w:sz="2" w:space="0" w:color="DDDDDD"/>
               <w:start w:val="single" w:sz="2" w:space="0" w:color="DDDDDD"/>
@@ -7188,7 +7188,7 @@
         </w:tc>
         <w:tc>
           <w:tcPr>
-            <w:tcW w:w="5762" w:type="dxa"/>
+            <w:tcW w:w="5763" w:type="dxa"/>
             <w:tcBorders>
               <w:top w:val="single" w:sz="2" w:space="0" w:color="DDDDDD"/>
               <w:start w:val="single" w:sz="2" w:space="0" w:color="DDDDDD"/>
@@ -7649,8 +7649,8 @@
         </w:tblCellMar>
       </w:tblPr>
       <w:tblGrid>
-        <w:gridCol w:w="3598"/>
-        <w:gridCol w:w="5762"/>
+        <w:gridCol w:w="3597"/>
+        <w:gridCol w:w="5763"/>
       </w:tblGrid>
       <w:tr>
         <w:trPr>
@@ -7659,7 +7659,7 @@
         </w:trPr>
         <w:tc>
           <w:tcPr>
-            <w:tcW w:w="3598" w:type="dxa"/>
+            <w:tcW w:w="3597" w:type="dxa"/>
             <w:tcBorders>
               <w:top w:val="single" w:sz="2" w:space="0" w:color="DDDDDD"/>
               <w:start w:val="single" w:sz="2" w:space="0" w:color="DDDDDD"/>
@@ -7702,7 +7702,7 @@
         </w:tc>
         <w:tc>
           <w:tcPr>
-            <w:tcW w:w="5762" w:type="dxa"/>
+            <w:tcW w:w="5763" w:type="dxa"/>
             <w:tcBorders>
               <w:top w:val="single" w:sz="2" w:space="0" w:color="DDDDDD"/>
               <w:start w:val="single" w:sz="2" w:space="0" w:color="DDDDDD"/>
@@ -7752,7 +7752,7 @@
         </w:trPr>
         <w:tc>
           <w:tcPr>
-            <w:tcW w:w="3598" w:type="dxa"/>
+            <w:tcW w:w="3597" w:type="dxa"/>
             <w:tcBorders>
               <w:top w:val="single" w:sz="2" w:space="0" w:color="DDDDDD"/>
               <w:start w:val="single" w:sz="2" w:space="0" w:color="DDDDDD"/>
@@ -7796,7 +7796,7 @@
         </w:tc>
         <w:tc>
           <w:tcPr>
-            <w:tcW w:w="5762" w:type="dxa"/>
+            <w:tcW w:w="5763" w:type="dxa"/>
             <w:tcBorders>
               <w:top w:val="single" w:sz="2" w:space="0" w:color="DDDDDD"/>
               <w:start w:val="single" w:sz="2" w:space="0" w:color="DDDDDD"/>
@@ -7846,7 +7846,7 @@
         </w:trPr>
         <w:tc>
           <w:tcPr>
-            <w:tcW w:w="3598" w:type="dxa"/>
+            <w:tcW w:w="3597" w:type="dxa"/>
             <w:tcBorders>
               <w:top w:val="single" w:sz="2" w:space="0" w:color="DDDDDD"/>
               <w:start w:val="single" w:sz="2" w:space="0" w:color="DDDDDD"/>
@@ -7890,7 +7890,7 @@
         </w:tc>
         <w:tc>
           <w:tcPr>
-            <w:tcW w:w="5762" w:type="dxa"/>
+            <w:tcW w:w="5763" w:type="dxa"/>
             <w:tcBorders>
               <w:top w:val="single" w:sz="2" w:space="0" w:color="DDDDDD"/>
               <w:start w:val="single" w:sz="2" w:space="0" w:color="DDDDDD"/>
@@ -7940,7 +7940,7 @@
         </w:trPr>
         <w:tc>
           <w:tcPr>
-            <w:tcW w:w="3598" w:type="dxa"/>
+            <w:tcW w:w="3597" w:type="dxa"/>
             <w:tcBorders>
               <w:top w:val="single" w:sz="2" w:space="0" w:color="DDDDDD"/>
               <w:start w:val="single" w:sz="2" w:space="0" w:color="DDDDDD"/>
@@ -7984,7 +7984,7 @@
         </w:tc>
         <w:tc>
           <w:tcPr>
-            <w:tcW w:w="5762" w:type="dxa"/>
+            <w:tcW w:w="5763" w:type="dxa"/>
             <w:tcBorders>
               <w:top w:val="single" w:sz="2" w:space="0" w:color="DDDDDD"/>
               <w:start w:val="single" w:sz="2" w:space="0" w:color="DDDDDD"/>
@@ -8034,7 +8034,7 @@
         </w:trPr>
         <w:tc>
           <w:tcPr>
-            <w:tcW w:w="3598" w:type="dxa"/>
+            <w:tcW w:w="3597" w:type="dxa"/>
             <w:tcBorders>
               <w:top w:val="single" w:sz="2" w:space="0" w:color="DDDDDD"/>
               <w:start w:val="single" w:sz="2" w:space="0" w:color="DDDDDD"/>
@@ -8078,7 +8078,7 @@
         </w:tc>
         <w:tc>
           <w:tcPr>
-            <w:tcW w:w="5762" w:type="dxa"/>
+            <w:tcW w:w="5763" w:type="dxa"/>
             <w:tcBorders>
               <w:top w:val="single" w:sz="2" w:space="0" w:color="DDDDDD"/>
               <w:start w:val="single" w:sz="2" w:space="0" w:color="DDDDDD"/>
@@ -8128,7 +8128,7 @@
         </w:trPr>
         <w:tc>
           <w:tcPr>
-            <w:tcW w:w="3598" w:type="dxa"/>
+            <w:tcW w:w="3597" w:type="dxa"/>
             <w:tcBorders>
               <w:top w:val="single" w:sz="2" w:space="0" w:color="DDDDDD"/>
               <w:start w:val="single" w:sz="2" w:space="0" w:color="DDDDDD"/>
@@ -8172,7 +8172,7 @@
         </w:tc>
         <w:tc>
           <w:tcPr>
-            <w:tcW w:w="5762" w:type="dxa"/>
+            <w:tcW w:w="5763" w:type="dxa"/>
             <w:tcBorders>
               <w:top w:val="single" w:sz="2" w:space="0" w:color="DDDDDD"/>
               <w:start w:val="single" w:sz="2" w:space="0" w:color="DDDDDD"/>
@@ -8222,7 +8222,7 @@
         </w:trPr>
         <w:tc>
           <w:tcPr>
-            <w:tcW w:w="3598" w:type="dxa"/>
+            <w:tcW w:w="3597" w:type="dxa"/>
             <w:tcBorders>
               <w:top w:val="single" w:sz="2" w:space="0" w:color="DDDDDD"/>
               <w:start w:val="single" w:sz="2" w:space="0" w:color="DDDDDD"/>
@@ -8266,7 +8266,7 @@
         </w:tc>
         <w:tc>
           <w:tcPr>
-            <w:tcW w:w="5762" w:type="dxa"/>
+            <w:tcW w:w="5763" w:type="dxa"/>
             <w:tcBorders>
               <w:top w:val="single" w:sz="2" w:space="0" w:color="DDDDDD"/>
               <w:start w:val="single" w:sz="2" w:space="0" w:color="DDDDDD"/>
@@ -8316,7 +8316,7 @@
         </w:trPr>
         <w:tc>
           <w:tcPr>
-            <w:tcW w:w="3598" w:type="dxa"/>
+            <w:tcW w:w="3597" w:type="dxa"/>
             <w:tcBorders>
               <w:top w:val="single" w:sz="2" w:space="0" w:color="DDDDDD"/>
               <w:start w:val="single" w:sz="2" w:space="0" w:color="DDDDDD"/>
@@ -8360,7 +8360,7 @@
         </w:tc>
         <w:tc>
           <w:tcPr>
-            <w:tcW w:w="5762" w:type="dxa"/>
+            <w:tcW w:w="5763" w:type="dxa"/>
             <w:tcBorders>
               <w:top w:val="single" w:sz="2" w:space="0" w:color="DDDDDD"/>
               <w:start w:val="single" w:sz="2" w:space="0" w:color="DDDDDD"/>
@@ -8410,7 +8410,7 @@
         </w:trPr>
         <w:tc>
           <w:tcPr>
-            <w:tcW w:w="3598" w:type="dxa"/>
+            <w:tcW w:w="3597" w:type="dxa"/>
             <w:tcBorders>
               <w:top w:val="single" w:sz="2" w:space="0" w:color="DDDDDD"/>
               <w:start w:val="single" w:sz="2" w:space="0" w:color="DDDDDD"/>
@@ -8454,7 +8454,7 @@
         </w:tc>
         <w:tc>
           <w:tcPr>
-            <w:tcW w:w="5762" w:type="dxa"/>
+            <w:tcW w:w="5763" w:type="dxa"/>
             <w:tcBorders>
               <w:top w:val="single" w:sz="2" w:space="0" w:color="DDDDDD"/>
               <w:start w:val="single" w:sz="2" w:space="0" w:color="DDDDDD"/>
@@ -9156,8 +9156,8 @@
         </w:tblCellMar>
       </w:tblPr>
       <w:tblGrid>
-        <w:gridCol w:w="3598"/>
-        <w:gridCol w:w="5762"/>
+        <w:gridCol w:w="3597"/>
+        <w:gridCol w:w="5763"/>
       </w:tblGrid>
       <w:tr>
         <w:trPr>
@@ -9166,7 +9166,7 @@
         </w:trPr>
         <w:tc>
           <w:tcPr>
-            <w:tcW w:w="3598" w:type="dxa"/>
+            <w:tcW w:w="3597" w:type="dxa"/>
             <w:tcBorders>
               <w:top w:val="single" w:sz="2" w:space="0" w:color="DDDDDD"/>
               <w:start w:val="single" w:sz="2" w:space="0" w:color="DDDDDD"/>
@@ -9209,7 +9209,7 @@
         </w:tc>
         <w:tc>
           <w:tcPr>
-            <w:tcW w:w="5762" w:type="dxa"/>
+            <w:tcW w:w="5763" w:type="dxa"/>
             <w:tcBorders>
               <w:top w:val="single" w:sz="2" w:space="0" w:color="DDDDDD"/>
               <w:start w:val="single" w:sz="2" w:space="0" w:color="DDDDDD"/>
@@ -9259,7 +9259,7 @@
         </w:trPr>
         <w:tc>
           <w:tcPr>
-            <w:tcW w:w="3598" w:type="dxa"/>
+            <w:tcW w:w="3597" w:type="dxa"/>
             <w:tcBorders>
               <w:top w:val="single" w:sz="2" w:space="0" w:color="DDDDDD"/>
               <w:start w:val="single" w:sz="2" w:space="0" w:color="DDDDDD"/>
@@ -9303,7 +9303,7 @@
         </w:tc>
         <w:tc>
           <w:tcPr>
-            <w:tcW w:w="5762" w:type="dxa"/>
+            <w:tcW w:w="5763" w:type="dxa"/>
             <w:tcBorders>
               <w:top w:val="single" w:sz="2" w:space="0" w:color="DDDDDD"/>
               <w:start w:val="single" w:sz="2" w:space="0" w:color="DDDDDD"/>
@@ -9431,7 +9431,7 @@
         </w:trPr>
         <w:tc>
           <w:tcPr>
-            <w:tcW w:w="3598" w:type="dxa"/>
+            <w:tcW w:w="3597" w:type="dxa"/>
             <w:tcBorders>
               <w:top w:val="single" w:sz="2" w:space="0" w:color="DDDDDD"/>
               <w:start w:val="single" w:sz="2" w:space="0" w:color="DDDDDD"/>
@@ -9475,7 +9475,7 @@
         </w:tc>
         <w:tc>
           <w:tcPr>
-            <w:tcW w:w="5762" w:type="dxa"/>
+            <w:tcW w:w="5763" w:type="dxa"/>
             <w:tcBorders>
               <w:top w:val="single" w:sz="2" w:space="0" w:color="DDDDDD"/>
               <w:start w:val="single" w:sz="2" w:space="0" w:color="DDDDDD"/>
@@ -9525,7 +9525,7 @@
         </w:trPr>
         <w:tc>
           <w:tcPr>
-            <w:tcW w:w="3598" w:type="dxa"/>
+            <w:tcW w:w="3597" w:type="dxa"/>
             <w:tcBorders>
               <w:top w:val="single" w:sz="2" w:space="0" w:color="DDDDDD"/>
               <w:start w:val="single" w:sz="2" w:space="0" w:color="DDDDDD"/>
@@ -9569,7 +9569,7 @@
         </w:tc>
         <w:tc>
           <w:tcPr>
-            <w:tcW w:w="5762" w:type="dxa"/>
+            <w:tcW w:w="5763" w:type="dxa"/>
             <w:tcBorders>
               <w:top w:val="single" w:sz="2" w:space="0" w:color="DDDDDD"/>
               <w:start w:val="single" w:sz="2" w:space="0" w:color="DDDDDD"/>
@@ -9619,7 +9619,7 @@
         </w:trPr>
         <w:tc>
           <w:tcPr>
-            <w:tcW w:w="3598" w:type="dxa"/>
+            <w:tcW w:w="3597" w:type="dxa"/>
             <w:tcBorders>
               <w:top w:val="single" w:sz="2" w:space="0" w:color="DDDDDD"/>
               <w:start w:val="single" w:sz="2" w:space="0" w:color="DDDDDD"/>
@@ -9663,7 +9663,7 @@
         </w:tc>
         <w:tc>
           <w:tcPr>
-            <w:tcW w:w="5762" w:type="dxa"/>
+            <w:tcW w:w="5763" w:type="dxa"/>
             <w:tcBorders>
               <w:top w:val="single" w:sz="2" w:space="0" w:color="DDDDDD"/>
               <w:start w:val="single" w:sz="2" w:space="0" w:color="DDDDDD"/>
@@ -12578,8 +12578,8 @@
         </w:tblCellMar>
       </w:tblPr>
       <w:tblGrid>
-        <w:gridCol w:w="3598"/>
-        <w:gridCol w:w="5762"/>
+        <w:gridCol w:w="3597"/>
+        <w:gridCol w:w="5763"/>
       </w:tblGrid>
       <w:tr>
         <w:trPr>
@@ -12588,7 +12588,7 @@
         </w:trPr>
         <w:tc>
           <w:tcPr>
-            <w:tcW w:w="3598" w:type="dxa"/>
+            <w:tcW w:w="3597" w:type="dxa"/>
             <w:tcBorders>
               <w:top w:val="single" w:sz="2" w:space="0" w:color="DDDDDD"/>
               <w:start w:val="single" w:sz="2" w:space="0" w:color="DDDDDD"/>
@@ -12632,7 +12632,7 @@
         </w:tc>
         <w:tc>
           <w:tcPr>
-            <w:tcW w:w="5762" w:type="dxa"/>
+            <w:tcW w:w="5763" w:type="dxa"/>
             <w:tcBorders>
               <w:top w:val="single" w:sz="2" w:space="0" w:color="DDDDDD"/>
               <w:start w:val="single" w:sz="2" w:space="0" w:color="DDDDDD"/>
@@ -12682,7 +12682,7 @@
         </w:trPr>
         <w:tc>
           <w:tcPr>
-            <w:tcW w:w="3598" w:type="dxa"/>
+            <w:tcW w:w="3597" w:type="dxa"/>
             <w:tcBorders>
               <w:top w:val="single" w:sz="2" w:space="0" w:color="DDDDDD"/>
               <w:start w:val="single" w:sz="2" w:space="0" w:color="DDDDDD"/>
@@ -12726,7 +12726,7 @@
         </w:tc>
         <w:tc>
           <w:tcPr>
-            <w:tcW w:w="5762" w:type="dxa"/>
+            <w:tcW w:w="5763" w:type="dxa"/>
             <w:tcBorders>
               <w:top w:val="single" w:sz="2" w:space="0" w:color="DDDDDD"/>
               <w:start w:val="single" w:sz="2" w:space="0" w:color="DDDDDD"/>
@@ -12776,7 +12776,7 @@
         </w:trPr>
         <w:tc>
           <w:tcPr>
-            <w:tcW w:w="3598" w:type="dxa"/>
+            <w:tcW w:w="3597" w:type="dxa"/>
             <w:tcBorders>
               <w:top w:val="single" w:sz="2" w:space="0" w:color="DDDDDD"/>
               <w:start w:val="single" w:sz="2" w:space="0" w:color="DDDDDD"/>
@@ -12820,7 +12820,7 @@
         </w:tc>
         <w:tc>
           <w:tcPr>
-            <w:tcW w:w="5762" w:type="dxa"/>
+            <w:tcW w:w="5763" w:type="dxa"/>
             <w:tcBorders>
               <w:top w:val="single" w:sz="2" w:space="0" w:color="DDDDDD"/>
               <w:start w:val="single" w:sz="2" w:space="0" w:color="DDDDDD"/>
@@ -12870,7 +12870,7 @@
         </w:trPr>
         <w:tc>
           <w:tcPr>
-            <w:tcW w:w="3598" w:type="dxa"/>
+            <w:tcW w:w="3597" w:type="dxa"/>
             <w:tcBorders>
               <w:top w:val="single" w:sz="2" w:space="0" w:color="DDDDDD"/>
               <w:start w:val="single" w:sz="2" w:space="0" w:color="DDDDDD"/>
@@ -12914,7 +12914,7 @@
         </w:tc>
         <w:tc>
           <w:tcPr>
-            <w:tcW w:w="5762" w:type="dxa"/>
+            <w:tcW w:w="5763" w:type="dxa"/>
             <w:tcBorders>
               <w:top w:val="single" w:sz="2" w:space="0" w:color="DDDDDD"/>
               <w:start w:val="single" w:sz="2" w:space="0" w:color="DDDDDD"/>
@@ -12964,7 +12964,7 @@
         </w:trPr>
         <w:tc>
           <w:tcPr>
-            <w:tcW w:w="3598" w:type="dxa"/>
+            <w:tcW w:w="3597" w:type="dxa"/>
             <w:tcBorders>
               <w:top w:val="single" w:sz="2" w:space="0" w:color="DDDDDD"/>
               <w:start w:val="single" w:sz="2" w:space="0" w:color="DDDDDD"/>
@@ -13008,7 +13008,7 @@
         </w:tc>
         <w:tc>
           <w:tcPr>
-            <w:tcW w:w="5762" w:type="dxa"/>
+            <w:tcW w:w="5763" w:type="dxa"/>
             <w:tcBorders>
               <w:top w:val="single" w:sz="2" w:space="0" w:color="DDDDDD"/>
               <w:start w:val="single" w:sz="2" w:space="0" w:color="DDDDDD"/>
@@ -13058,7 +13058,7 @@
         </w:trPr>
         <w:tc>
           <w:tcPr>
-            <w:tcW w:w="3598" w:type="dxa"/>
+            <w:tcW w:w="3597" w:type="dxa"/>
             <w:tcBorders>
               <w:top w:val="single" w:sz="2" w:space="0" w:color="DDDDDD"/>
               <w:start w:val="single" w:sz="2" w:space="0" w:color="DDDDDD"/>
@@ -13102,7 +13102,7 @@
         </w:tc>
         <w:tc>
           <w:tcPr>
-            <w:tcW w:w="5762" w:type="dxa"/>
+            <w:tcW w:w="5763" w:type="dxa"/>
             <w:tcBorders>
               <w:top w:val="single" w:sz="2" w:space="0" w:color="DDDDDD"/>
               <w:start w:val="single" w:sz="2" w:space="0" w:color="DDDDDD"/>
@@ -13277,7 +13277,67 @@
           <w:u w:val="none" w:color="D4D4D4"/>
           <w:lang w:val="en-US"/>
         </w:rPr>
-        <w:t>[photo: 2026-0324-Tadoba-NCM-9512.JPG | The tiger, finally spotted]\n\n</w:t>
+        <w:t>\n\n</w:t>
+      </w:r>
+      <w:r>
+        <w:rPr>
+          <w:rFonts w:ascii="Courier New" w:hAnsi="Courier New"/>
+          <w:outline w:val="false"/>
+          <w:color w:val="000000"/>
+          <w:sz w:val="18"/>
+          <w:szCs w:val="18"/>
+          <w:u w:val="none" w:color="D4D4D4"/>
+          <w:lang w:val="en-US"/>
+        </w:rPr>
+        <w:t xml:space="preserve">[photo: 2026-0324-Tadoba-NCM-9463.JPG | The </w:t>
+      </w:r>
+      <w:r>
+        <w:rPr>
+          <w:rFonts w:ascii="Courier New" w:hAnsi="Courier New"/>
+          <w:outline w:val="false"/>
+          <w:color w:val="000000"/>
+          <w:sz w:val="18"/>
+          <w:szCs w:val="18"/>
+          <w:u w:val="none" w:color="D4D4D4"/>
+          <w:lang w:val="en-US"/>
+        </w:rPr>
+        <w:t>G</w:t>
+      </w:r>
+      <w:r>
+        <w:rPr>
+          <w:rFonts w:ascii="Courier New" w:hAnsi="Courier New"/>
+          <w:outline w:val="false"/>
+          <w:color w:val="000000"/>
+          <w:sz w:val="18"/>
+          <w:szCs w:val="18"/>
+          <w:u w:val="none" w:color="D4D4D4"/>
+          <w:lang w:val="en-US"/>
+        </w:rPr>
+        <w:t>o</w:t>
+      </w:r>
+      <w:r>
+        <w:rPr>
+          <w:rFonts w:ascii="Courier New" w:hAnsi="Courier New"/>
+          <w:outline w:val="false"/>
+          <w:color w:val="000000"/>
+          <w:sz w:val="18"/>
+          <w:szCs w:val="18"/>
+          <w:u w:val="none" w:color="D4D4D4"/>
+          <w:lang w:val="en-US"/>
+        </w:rPr>
+        <w:t>al: The Tiger</w:t>
+      </w:r>
+      <w:r>
+        <w:rPr>
+          <w:rFonts w:ascii="Courier New" w:hAnsi="Courier New"/>
+          <w:outline w:val="false"/>
+          <w:color w:val="000000"/>
+          <w:sz w:val="18"/>
+          <w:szCs w:val="18"/>
+          <w:u w:val="none" w:color="D4D4D4"/>
+          <w:lang w:val="en-US"/>
+        </w:rPr>
+        <w:t>]\n\n</w:t>
       </w:r>
     </w:p>
     <w:p>
@@ -14077,8 +14137,8 @@
         </w:tblCellMar>
       </w:tblPr>
       <w:tblGrid>
-        <w:gridCol w:w="3598"/>
-        <w:gridCol w:w="5762"/>
+        <w:gridCol w:w="3597"/>
+        <w:gridCol w:w="5763"/>
       </w:tblGrid>
       <w:tr>
         <w:trPr>
@@ -14087,7 +14147,7 @@
         </w:trPr>
         <w:tc>
           <w:tcPr>
-            <w:tcW w:w="3598" w:type="dxa"/>
+            <w:tcW w:w="3597" w:type="dxa"/>
             <w:tcBorders>
               <w:top w:val="single" w:sz="2" w:space="0" w:color="DDDDDD"/>
               <w:start w:val="single" w:sz="2" w:space="0" w:color="DDDDDD"/>
@@ -14131,7 +14191,7 @@
         </w:tc>
         <w:tc>
           <w:tcPr>
-            <w:tcW w:w="5762" w:type="dxa"/>
+            <w:tcW w:w="5763" w:type="dxa"/>
             <w:tcBorders>
               <w:top w:val="single" w:sz="2" w:space="0" w:color="DDDDDD"/>
               <w:start w:val="single" w:sz="2" w:space="0" w:color="DDDDDD"/>
@@ -14181,7 +14241,7 @@
         </w:trPr>
         <w:tc>
           <w:tcPr>
-            <w:tcW w:w="3598" w:type="dxa"/>
+            <w:tcW w:w="3597" w:type="dxa"/>
             <w:tcBorders>
               <w:top w:val="single" w:sz="2" w:space="0" w:color="DDDDDD"/>
               <w:start w:val="single" w:sz="2" w:space="0" w:color="DDDDDD"/>
@@ -14225,7 +14285,7 @@
         </w:tc>
         <w:tc>
           <w:tcPr>
-            <w:tcW w:w="5762" w:type="dxa"/>
+            <w:tcW w:w="5763" w:type="dxa"/>
             <w:tcBorders>
               <w:top w:val="single" w:sz="2" w:space="0" w:color="DDDDDD"/>
               <w:start w:val="single" w:sz="2" w:space="0" w:color="DDDDDD"/>
@@ -14275,7 +14335,7 @@
         </w:trPr>
         <w:tc>
           <w:tcPr>
-            <w:tcW w:w="3598" w:type="dxa"/>
+            <w:tcW w:w="3597" w:type="dxa"/>
             <w:tcBorders>
               <w:top w:val="single" w:sz="2" w:space="0" w:color="DDDDDD"/>
               <w:start w:val="single" w:sz="2" w:space="0" w:color="DDDDDD"/>
@@ -14319,7 +14379,7 @@
         </w:tc>
         <w:tc>
           <w:tcPr>
-            <w:tcW w:w="5762" w:type="dxa"/>
+            <w:tcW w:w="5763" w:type="dxa"/>
             <w:tcBorders>
               <w:top w:val="single" w:sz="2" w:space="0" w:color="DDDDDD"/>
               <w:start w:val="single" w:sz="2" w:space="0" w:color="DDDDDD"/>
@@ -14369,7 +14429,7 @@
         </w:trPr>
         <w:tc>
           <w:tcPr>
-            <w:tcW w:w="3598" w:type="dxa"/>
+            <w:tcW w:w="3597" w:type="dxa"/>
             <w:tcBorders>
               <w:top w:val="single" w:sz="2" w:space="0" w:color="DDDDDD"/>
               <w:start w:val="single" w:sz="2" w:space="0" w:color="DDDDDD"/>
@@ -14412,7 +14472,7 @@
         </w:tc>
         <w:tc>
           <w:tcPr>
-            <w:tcW w:w="5762" w:type="dxa"/>
+            <w:tcW w:w="5763" w:type="dxa"/>
             <w:tcBorders>
               <w:top w:val="single" w:sz="2" w:space="0" w:color="DDDDDD"/>
               <w:start w:val="single" w:sz="2" w:space="0" w:color="DDDDDD"/>
@@ -15203,8 +15263,8 @@
         </w:tblCellMar>
       </w:tblPr>
       <w:tblGrid>
-        <w:gridCol w:w="3598"/>
-        <w:gridCol w:w="5762"/>
+        <w:gridCol w:w="3597"/>
+        <w:gridCol w:w="5763"/>
       </w:tblGrid>
       <w:tr>
         <w:trPr>
@@ -15213,7 +15273,7 @@
         </w:trPr>
         <w:tc>
           <w:tcPr>
-            <w:tcW w:w="3598" w:type="dxa"/>
+            <w:tcW w:w="3597" w:type="dxa"/>
             <w:tcBorders>
               <w:top w:val="single" w:sz="2" w:space="0" w:color="DDDDDD"/>
               <w:start w:val="single" w:sz="2" w:space="0" w:color="DDDDDD"/>
@@ -15257,7 +15317,7 @@
         </w:tc>
         <w:tc>
           <w:tcPr>
-            <w:tcW w:w="5762" w:type="dxa"/>
+            <w:tcW w:w="5763" w:type="dxa"/>
             <w:tcBorders>
               <w:top w:val="single" w:sz="2" w:space="0" w:color="DDDDDD"/>
               <w:start w:val="single" w:sz="2" w:space="0" w:color="DDDDDD"/>
@@ -15307,7 +15367,7 @@
         </w:trPr>
         <w:tc>
           <w:tcPr>
-            <w:tcW w:w="3598" w:type="dxa"/>
+            <w:tcW w:w="3597" w:type="dxa"/>
             <w:tcBorders>
               <w:top w:val="single" w:sz="2" w:space="0" w:color="DDDDDD"/>
               <w:start w:val="single" w:sz="2" w:space="0" w:color="DDDDDD"/>
@@ -15351,7 +15411,7 @@
         </w:tc>
         <w:tc>
           <w:tcPr>
-            <w:tcW w:w="5762" w:type="dxa"/>
+            <w:tcW w:w="5763" w:type="dxa"/>
             <w:tcBorders>
               <w:top w:val="single" w:sz="2" w:space="0" w:color="DDDDDD"/>
               <w:start w:val="single" w:sz="2" w:space="0" w:color="DDDDDD"/>
@@ -15413,7 +15473,7 @@
         </w:trPr>
         <w:tc>
           <w:tcPr>
-            <w:tcW w:w="3598" w:type="dxa"/>
+            <w:tcW w:w="3597" w:type="dxa"/>
             <w:tcBorders>
               <w:top w:val="single" w:sz="2" w:space="0" w:color="DDDDDD"/>
               <w:start w:val="single" w:sz="2" w:space="0" w:color="DDDDDD"/>
@@ -15457,7 +15517,7 @@
         </w:tc>
         <w:tc>
           <w:tcPr>
-            <w:tcW w:w="5762" w:type="dxa"/>
+            <w:tcW w:w="5763" w:type="dxa"/>
             <w:tcBorders>
               <w:top w:val="single" w:sz="2" w:space="0" w:color="DDDDDD"/>
               <w:start w:val="single" w:sz="2" w:space="0" w:color="DDDDDD"/>
@@ -15519,7 +15579,7 @@
         </w:trPr>
         <w:tc>
           <w:tcPr>
-            <w:tcW w:w="3598" w:type="dxa"/>
+            <w:tcW w:w="3597" w:type="dxa"/>
             <w:tcBorders>
               <w:top w:val="single" w:sz="2" w:space="0" w:color="DDDDDD"/>
               <w:start w:val="single" w:sz="2" w:space="0" w:color="DDDDDD"/>
@@ -15563,7 +15623,7 @@
         </w:tc>
         <w:tc>
           <w:tcPr>
-            <w:tcW w:w="5762" w:type="dxa"/>
+            <w:tcW w:w="5763" w:type="dxa"/>
             <w:tcBorders>
               <w:top w:val="single" w:sz="2" w:space="0" w:color="DDDDDD"/>
               <w:start w:val="single" w:sz="2" w:space="0" w:color="DDDDDD"/>
@@ -15625,7 +15685,7 @@
         </w:trPr>
         <w:tc>
           <w:tcPr>
-            <w:tcW w:w="3598" w:type="dxa"/>
+            <w:tcW w:w="3597" w:type="dxa"/>
             <w:tcBorders>
               <w:top w:val="single" w:sz="2" w:space="0" w:color="DDDDDD"/>
               <w:start w:val="single" w:sz="2" w:space="0" w:color="DDDDDD"/>
@@ -15669,7 +15729,7 @@
         </w:tc>
         <w:tc>
           <w:tcPr>
-            <w:tcW w:w="5762" w:type="dxa"/>
+            <w:tcW w:w="5763" w:type="dxa"/>
             <w:tcBorders>
               <w:top w:val="single" w:sz="2" w:space="0" w:color="DDDDDD"/>
               <w:start w:val="single" w:sz="2" w:space="0" w:color="DDDDDD"/>
@@ -15731,7 +15791,7 @@
         </w:trPr>
         <w:tc>
           <w:tcPr>
-            <w:tcW w:w="3598" w:type="dxa"/>
+            <w:tcW w:w="3597" w:type="dxa"/>
             <w:tcBorders>
               <w:top w:val="single" w:sz="2" w:space="0" w:color="DDDDDD"/>
               <w:start w:val="single" w:sz="2" w:space="0" w:color="DDDDDD"/>
@@ -15775,7 +15835,7 @@
         </w:tc>
         <w:tc>
           <w:tcPr>
-            <w:tcW w:w="5762" w:type="dxa"/>
+            <w:tcW w:w="5763" w:type="dxa"/>
             <w:tcBorders>
               <w:top w:val="single" w:sz="2" w:space="0" w:color="DDDDDD"/>
               <w:start w:val="single" w:sz="2" w:space="0" w:color="DDDDDD"/>
@@ -15825,7 +15885,7 @@
         </w:trPr>
         <w:tc>
           <w:tcPr>
-            <w:tcW w:w="3598" w:type="dxa"/>
+            <w:tcW w:w="3597" w:type="dxa"/>
             <w:tcBorders>
               <w:top w:val="single" w:sz="2" w:space="0" w:color="DDDDDD"/>
               <w:start w:val="single" w:sz="2" w:space="0" w:color="DDDDDD"/>
@@ -15869,7 +15929,7 @@
         </w:tc>
         <w:tc>
           <w:tcPr>
-            <w:tcW w:w="5762" w:type="dxa"/>
+            <w:tcW w:w="5763" w:type="dxa"/>
             <w:tcBorders>
               <w:top w:val="single" w:sz="2" w:space="0" w:color="DDDDDD"/>
               <w:start w:val="single" w:sz="2" w:space="0" w:color="DDDDDD"/>
@@ -17538,8 +17598,8 @@
         </w:tblCellMar>
       </w:tblPr>
       <w:tblGrid>
-        <w:gridCol w:w="3598"/>
-        <w:gridCol w:w="5762"/>
+        <w:gridCol w:w="3597"/>
+        <w:gridCol w:w="5763"/>
       </w:tblGrid>
       <w:tr>
         <w:trPr>
@@ -17548,7 +17608,7 @@
         </w:trPr>
         <w:tc>
           <w:tcPr>
-            <w:tcW w:w="3598" w:type="dxa"/>
+            <w:tcW w:w="3597" w:type="dxa"/>
             <w:tcBorders>
               <w:top w:val="single" w:sz="2" w:space="0" w:color="DDDDDD"/>
               <w:start w:val="single" w:sz="2" w:space="0" w:color="DDDDDD"/>
@@ -17592,7 +17652,7 @@
         </w:tc>
         <w:tc>
           <w:tcPr>
-            <w:tcW w:w="5762" w:type="dxa"/>
+            <w:tcW w:w="5763" w:type="dxa"/>
             <w:tcBorders>
               <w:top w:val="single" w:sz="2" w:space="0" w:color="DDDDDD"/>
               <w:start w:val="single" w:sz="2" w:space="0" w:color="DDDDDD"/>
@@ -17642,7 +17702,7 @@
         </w:trPr>
         <w:tc>
           <w:tcPr>
-            <w:tcW w:w="3598" w:type="dxa"/>
+            <w:tcW w:w="3597" w:type="dxa"/>
             <w:tcBorders>
               <w:top w:val="single" w:sz="2" w:space="0" w:color="DDDDDD"/>
               <w:start w:val="single" w:sz="2" w:space="0" w:color="DDDDDD"/>
@@ -17686,7 +17746,7 @@
         </w:tc>
         <w:tc>
           <w:tcPr>
-            <w:tcW w:w="5762" w:type="dxa"/>
+            <w:tcW w:w="5763" w:type="dxa"/>
             <w:tcBorders>
               <w:top w:val="single" w:sz="2" w:space="0" w:color="DDDDDD"/>
               <w:start w:val="single" w:sz="2" w:space="0" w:color="DDDDDD"/>
@@ -17736,7 +17796,7 @@
         </w:trPr>
         <w:tc>
           <w:tcPr>
-            <w:tcW w:w="3598" w:type="dxa"/>
+            <w:tcW w:w="3597" w:type="dxa"/>
             <w:tcBorders>
               <w:top w:val="single" w:sz="2" w:space="0" w:color="DDDDDD"/>
               <w:start w:val="single" w:sz="2" w:space="0" w:color="DDDDDD"/>
@@ -17780,7 +17840,7 @@
         </w:tc>
         <w:tc>
           <w:tcPr>
-            <w:tcW w:w="5762" w:type="dxa"/>
+            <w:tcW w:w="5763" w:type="dxa"/>
             <w:tcBorders>
               <w:top w:val="single" w:sz="2" w:space="0" w:color="DDDDDD"/>
               <w:start w:val="single" w:sz="2" w:space="0" w:color="DDDDDD"/>
@@ -17830,7 +17890,7 @@
         </w:trPr>
         <w:tc>
           <w:tcPr>
-            <w:tcW w:w="3598" w:type="dxa"/>
+            <w:tcW w:w="3597" w:type="dxa"/>
             <w:tcBorders>
               <w:top w:val="single" w:sz="2" w:space="0" w:color="DDDDDD"/>
               <w:start w:val="single" w:sz="2" w:space="0" w:color="DDDDDD"/>
@@ -17874,7 +17934,7 @@
         </w:tc>
         <w:tc>
           <w:tcPr>
-            <w:tcW w:w="5762" w:type="dxa"/>
+            <w:tcW w:w="5763" w:type="dxa"/>
             <w:tcBorders>
               <w:top w:val="single" w:sz="2" w:space="0" w:color="DDDDDD"/>
               <w:start w:val="single" w:sz="2" w:space="0" w:color="DDDDDD"/>
@@ -17924,7 +17984,7 @@
         </w:trPr>
         <w:tc>
           <w:tcPr>
-            <w:tcW w:w="3598" w:type="dxa"/>
+            <w:tcW w:w="3597" w:type="dxa"/>
             <w:tcBorders>
               <w:top w:val="single" w:sz="2" w:space="0" w:color="DDDDDD"/>
               <w:start w:val="single" w:sz="2" w:space="0" w:color="DDDDDD"/>
@@ -17968,7 +18028,7 @@
         </w:tc>
         <w:tc>
           <w:tcPr>
-            <w:tcW w:w="5762" w:type="dxa"/>
+            <w:tcW w:w="5763" w:type="dxa"/>
             <w:tcBorders>
               <w:top w:val="single" w:sz="2" w:space="0" w:color="DDDDDD"/>
               <w:start w:val="single" w:sz="2" w:space="0" w:color="DDDDDD"/>
@@ -18018,7 +18078,7 @@
         </w:trPr>
         <w:tc>
           <w:tcPr>
-            <w:tcW w:w="3598" w:type="dxa"/>
+            <w:tcW w:w="3597" w:type="dxa"/>
             <w:tcBorders>
               <w:top w:val="single" w:sz="2" w:space="0" w:color="DDDDDD"/>
               <w:start w:val="single" w:sz="2" w:space="0" w:color="DDDDDD"/>
@@ -18062,7 +18122,7 @@
         </w:tc>
         <w:tc>
           <w:tcPr>
-            <w:tcW w:w="5762" w:type="dxa"/>
+            <w:tcW w:w="5763" w:type="dxa"/>
             <w:tcBorders>
               <w:top w:val="single" w:sz="2" w:space="0" w:color="DDDDDD"/>
               <w:start w:val="single" w:sz="2" w:space="0" w:color="DDDDDD"/>
@@ -18112,7 +18172,7 @@
         </w:trPr>
         <w:tc>
           <w:tcPr>
-            <w:tcW w:w="3598" w:type="dxa"/>
+            <w:tcW w:w="3597" w:type="dxa"/>
             <w:tcBorders>
               <w:top w:val="single" w:sz="2" w:space="0" w:color="DDDDDD"/>
               <w:start w:val="single" w:sz="2" w:space="0" w:color="DDDDDD"/>
@@ -18156,7 +18216,7 @@
         </w:tc>
         <w:tc>
           <w:tcPr>
-            <w:tcW w:w="5762" w:type="dxa"/>
+            <w:tcW w:w="5763" w:type="dxa"/>
             <w:tcBorders>
               <w:top w:val="single" w:sz="2" w:space="0" w:color="DDDDDD"/>
               <w:start w:val="single" w:sz="2" w:space="0" w:color="DDDDDD"/>
@@ -19806,8 +19866,8 @@
         </w:tblCellMar>
       </w:tblPr>
       <w:tblGrid>
-        <w:gridCol w:w="3598"/>
-        <w:gridCol w:w="5762"/>
+        <w:gridCol w:w="3597"/>
+        <w:gridCol w:w="5763"/>
       </w:tblGrid>
       <w:tr>
         <w:trPr>
@@ -19816,7 +19876,7 @@
         </w:trPr>
         <w:tc>
           <w:tcPr>
-            <w:tcW w:w="3598" w:type="dxa"/>
+            <w:tcW w:w="3597" w:type="dxa"/>
             <w:tcBorders>
               <w:top w:val="single" w:sz="2" w:space="0" w:color="DDDDDD"/>
               <w:start w:val="single" w:sz="2" w:space="0" w:color="DDDDDD"/>
@@ -19860,7 +19920,7 @@
         </w:tc>
         <w:tc>
           <w:tcPr>
-            <w:tcW w:w="5762" w:type="dxa"/>
+            <w:tcW w:w="5763" w:type="dxa"/>
             <w:tcBorders>
               <w:top w:val="single" w:sz="2" w:space="0" w:color="DDDDDD"/>
               <w:start w:val="single" w:sz="2" w:space="0" w:color="DDDDDD"/>
@@ -19909,7 +19969,7 @@
         </w:trPr>
         <w:tc>
           <w:tcPr>
-            <w:tcW w:w="3598" w:type="dxa"/>
+            <w:tcW w:w="3597" w:type="dxa"/>
             <w:tcBorders>
               <w:top w:val="single" w:sz="2" w:space="0" w:color="DDDDDD"/>
               <w:start w:val="single" w:sz="2" w:space="0" w:color="DDDDDD"/>
@@ -19953,7 +20013,7 @@
         </w:tc>
         <w:tc>
           <w:tcPr>
-            <w:tcW w:w="5762" w:type="dxa"/>
+            <w:tcW w:w="5763" w:type="dxa"/>
             <w:tcBorders>
               <w:top w:val="single" w:sz="2" w:space="0" w:color="DDDDDD"/>
               <w:start w:val="single" w:sz="2" w:space="0" w:color="DDDDDD"/>
@@ -20003,7 +20063,7 @@
         </w:trPr>
         <w:tc>
           <w:tcPr>
-            <w:tcW w:w="3598" w:type="dxa"/>
+            <w:tcW w:w="3597" w:type="dxa"/>
             <w:tcBorders>
               <w:top w:val="single" w:sz="2" w:space="0" w:color="DDDDDD"/>
               <w:start w:val="single" w:sz="2" w:space="0" w:color="DDDDDD"/>
@@ -20047,7 +20107,7 @@
         </w:tc>
         <w:tc>
           <w:tcPr>
-            <w:tcW w:w="5762" w:type="dxa"/>
+            <w:tcW w:w="5763" w:type="dxa"/>
             <w:tcBorders>
               <w:top w:val="single" w:sz="2" w:space="0" w:color="DDDDDD"/>
               <w:start w:val="single" w:sz="2" w:space="0" w:color="DDDDDD"/>
@@ -20097,7 +20157,7 @@
         </w:trPr>
         <w:tc>
           <w:tcPr>
-            <w:tcW w:w="3598" w:type="dxa"/>
+            <w:tcW w:w="3597" w:type="dxa"/>
             <w:tcBorders>
               <w:top w:val="single" w:sz="2" w:space="0" w:color="DDDDDD"/>
               <w:start w:val="single" w:sz="2" w:space="0" w:color="DDDDDD"/>
@@ -20141,7 +20201,7 @@
         </w:tc>
         <w:tc>
           <w:tcPr>
-            <w:tcW w:w="5762" w:type="dxa"/>
+            <w:tcW w:w="5763" w:type="dxa"/>
             <w:tcBorders>
               <w:top w:val="single" w:sz="2" w:space="0" w:color="DDDDDD"/>
               <w:start w:val="single" w:sz="2" w:space="0" w:color="DDDDDD"/>
@@ -21107,8 +21167,8 @@
         </w:tblCellMar>
       </w:tblPr>
       <w:tblGrid>
-        <w:gridCol w:w="3598"/>
-        <w:gridCol w:w="5762"/>
+        <w:gridCol w:w="3597"/>
+        <w:gridCol w:w="5763"/>
       </w:tblGrid>
       <w:tr>
         <w:trPr>
@@ -21117,7 +21177,7 @@
         </w:trPr>
         <w:tc>
           <w:tcPr>
-            <w:tcW w:w="3598" w:type="dxa"/>
+            <w:tcW w:w="3597" w:type="dxa"/>
             <w:tcBorders>
               <w:top w:val="single" w:sz="2" w:space="0" w:color="DDDDDD"/>
               <w:start w:val="single" w:sz="2" w:space="0" w:color="DDDDDD"/>
@@ -21161,7 +21221,7 @@
         </w:tc>
         <w:tc>
           <w:tcPr>
-            <w:tcW w:w="5762" w:type="dxa"/>
+            <w:tcW w:w="5763" w:type="dxa"/>
             <w:tcBorders>
               <w:top w:val="single" w:sz="2" w:space="0" w:color="DDDDDD"/>
               <w:start w:val="single" w:sz="2" w:space="0" w:color="DDDDDD"/>
@@ -21211,7 +21271,7 @@
         </w:trPr>
         <w:tc>
           <w:tcPr>
-            <w:tcW w:w="3598" w:type="dxa"/>
+            <w:tcW w:w="3597" w:type="dxa"/>
             <w:tcBorders>
               <w:top w:val="single" w:sz="2" w:space="0" w:color="DDDDDD"/>
               <w:start w:val="single" w:sz="2" w:space="0" w:color="DDDDDD"/>
@@ -21255,7 +21315,7 @@
         </w:tc>
         <w:tc>
           <w:tcPr>
-            <w:tcW w:w="5762" w:type="dxa"/>
+            <w:tcW w:w="5763" w:type="dxa"/>
             <w:tcBorders>
               <w:top w:val="single" w:sz="2" w:space="0" w:color="DDDDDD"/>
               <w:start w:val="single" w:sz="2" w:space="0" w:color="DDDDDD"/>
@@ -21304,7 +21364,7 @@
         </w:trPr>
         <w:tc>
           <w:tcPr>
-            <w:tcW w:w="3598" w:type="dxa"/>
+            <w:tcW w:w="3597" w:type="dxa"/>
             <w:tcBorders>
               <w:top w:val="single" w:sz="2" w:space="0" w:color="DDDDDD"/>
               <w:start w:val="single" w:sz="2" w:space="0" w:color="DDDDDD"/>
@@ -21348,7 +21408,7 @@
         </w:tc>
         <w:tc>
           <w:tcPr>
-            <w:tcW w:w="5762" w:type="dxa"/>
+            <w:tcW w:w="5763" w:type="dxa"/>
             <w:tcBorders>
               <w:top w:val="single" w:sz="2" w:space="0" w:color="DDDDDD"/>
               <w:start w:val="single" w:sz="2" w:space="0" w:color="DDDDDD"/>
@@ -21398,7 +21458,7 @@
         </w:trPr>
         <w:tc>
           <w:tcPr>
-            <w:tcW w:w="3598" w:type="dxa"/>
+            <w:tcW w:w="3597" w:type="dxa"/>
             <w:tcBorders>
               <w:top w:val="single" w:sz="2" w:space="0" w:color="DDDDDD"/>
               <w:start w:val="single" w:sz="2" w:space="0" w:color="DDDDDD"/>
@@ -21442,7 +21502,7 @@
         </w:tc>
         <w:tc>
           <w:tcPr>
-            <w:tcW w:w="5762" w:type="dxa"/>
+            <w:tcW w:w="5763" w:type="dxa"/>
             <w:tcBorders>
               <w:top w:val="single" w:sz="2" w:space="0" w:color="DDDDDD"/>
               <w:start w:val="single" w:sz="2" w:space="0" w:color="DDDDDD"/>
@@ -21492,7 +21552,7 @@
         </w:trPr>
         <w:tc>
           <w:tcPr>
-            <w:tcW w:w="3598" w:type="dxa"/>
+            <w:tcW w:w="3597" w:type="dxa"/>
             <w:tcBorders>
               <w:top w:val="single" w:sz="2" w:space="0" w:color="DDDDDD"/>
               <w:start w:val="single" w:sz="2" w:space="0" w:color="DDDDDD"/>
@@ -21536,7 +21596,7 @@
         </w:tc>
         <w:tc>
           <w:tcPr>
-            <w:tcW w:w="5762" w:type="dxa"/>
+            <w:tcW w:w="5763" w:type="dxa"/>
             <w:tcBorders>
               <w:top w:val="single" w:sz="2" w:space="0" w:color="DDDDDD"/>
               <w:start w:val="single" w:sz="2" w:space="0" w:color="DDDDDD"/>
@@ -21678,8 +21738,8 @@
         </w:tblCellMar>
       </w:tblPr>
       <w:tblGrid>
-        <w:gridCol w:w="3598"/>
-        <w:gridCol w:w="5762"/>
+        <w:gridCol w:w="3597"/>
+        <w:gridCol w:w="5763"/>
       </w:tblGrid>
       <w:tr>
         <w:trPr>
@@ -21688,7 +21748,7 @@
         </w:trPr>
         <w:tc>
           <w:tcPr>
-            <w:tcW w:w="3598" w:type="dxa"/>
+            <w:tcW w:w="3597" w:type="dxa"/>
             <w:tcBorders>
               <w:top w:val="single" w:sz="2" w:space="0" w:color="DDDDDD"/>
               <w:start w:val="single" w:sz="2" w:space="0" w:color="DDDDDD"/>
@@ -21732,7 +21792,7 @@
         </w:tc>
         <w:tc>
           <w:tcPr>
-            <w:tcW w:w="5762" w:type="dxa"/>
+            <w:tcW w:w="5763" w:type="dxa"/>
             <w:tcBorders>
               <w:top w:val="single" w:sz="2" w:space="0" w:color="DDDDDD"/>
               <w:start w:val="single" w:sz="2" w:space="0" w:color="DDDDDD"/>
@@ -21782,7 +21842,7 @@
         </w:trPr>
         <w:tc>
           <w:tcPr>
-            <w:tcW w:w="3598" w:type="dxa"/>
+            <w:tcW w:w="3597" w:type="dxa"/>
             <w:tcBorders>
               <w:top w:val="single" w:sz="2" w:space="0" w:color="DDDDDD"/>
               <w:start w:val="single" w:sz="2" w:space="0" w:color="DDDDDD"/>
@@ -21826,7 +21886,7 @@
         </w:tc>
         <w:tc>
           <w:tcPr>
-            <w:tcW w:w="5762" w:type="dxa"/>
+            <w:tcW w:w="5763" w:type="dxa"/>
             <w:tcBorders>
               <w:top w:val="single" w:sz="2" w:space="0" w:color="DDDDDD"/>
               <w:start w:val="single" w:sz="2" w:space="0" w:color="DDDDDD"/>
@@ -21876,7 +21936,7 @@
         </w:trPr>
         <w:tc>
           <w:tcPr>
-            <w:tcW w:w="3598" w:type="dxa"/>
+            <w:tcW w:w="3597" w:type="dxa"/>
             <w:tcBorders>
               <w:top w:val="single" w:sz="2" w:space="0" w:color="DDDDDD"/>
               <w:start w:val="single" w:sz="2" w:space="0" w:color="DDDDDD"/>
@@ -21920,7 +21980,7 @@
         </w:tc>
         <w:tc>
           <w:tcPr>
-            <w:tcW w:w="5762" w:type="dxa"/>
+            <w:tcW w:w="5763" w:type="dxa"/>
             <w:tcBorders>
               <w:top w:val="single" w:sz="2" w:space="0" w:color="DDDDDD"/>
               <w:start w:val="single" w:sz="2" w:space="0" w:color="DDDDDD"/>
@@ -21970,7 +22030,7 @@
         </w:trPr>
         <w:tc>
           <w:tcPr>
-            <w:tcW w:w="3598" w:type="dxa"/>
+            <w:tcW w:w="3597" w:type="dxa"/>
             <w:tcBorders>
               <w:top w:val="single" w:sz="2" w:space="0" w:color="DDDDDD"/>
               <w:start w:val="single" w:sz="2" w:space="0" w:color="DDDDDD"/>
@@ -22014,7 +22074,7 @@
         </w:tc>
         <w:tc>
           <w:tcPr>
-            <w:tcW w:w="5762" w:type="dxa"/>
+            <w:tcW w:w="5763" w:type="dxa"/>
             <w:tcBorders>
               <w:top w:val="single" w:sz="2" w:space="0" w:color="DDDDDD"/>
               <w:start w:val="single" w:sz="2" w:space="0" w:color="DDDDDD"/>
@@ -22064,7 +22124,7 @@
         </w:trPr>
         <w:tc>
           <w:tcPr>
-            <w:tcW w:w="3598" w:type="dxa"/>
+            <w:tcW w:w="3597" w:type="dxa"/>
             <w:tcBorders>
               <w:top w:val="single" w:sz="2" w:space="0" w:color="DDDDDD"/>
               <w:start w:val="single" w:sz="2" w:space="0" w:color="DDDDDD"/>
@@ -22108,7 +22168,7 @@
         </w:tc>
         <w:tc>
           <w:tcPr>
-            <w:tcW w:w="5762" w:type="dxa"/>
+            <w:tcW w:w="5763" w:type="dxa"/>
             <w:tcBorders>
               <w:top w:val="single" w:sz="2" w:space="0" w:color="DDDDDD"/>
               <w:start w:val="single" w:sz="2" w:space="0" w:color="DDDDDD"/>
@@ -22158,7 +22218,7 @@
         </w:trPr>
         <w:tc>
           <w:tcPr>
-            <w:tcW w:w="3598" w:type="dxa"/>
+            <w:tcW w:w="3597" w:type="dxa"/>
             <w:tcBorders>
               <w:top w:val="single" w:sz="2" w:space="0" w:color="DDDDDD"/>
               <w:start w:val="single" w:sz="2" w:space="0" w:color="DDDDDD"/>
@@ -22202,7 +22262,7 @@
         </w:tc>
         <w:tc>
           <w:tcPr>
-            <w:tcW w:w="5762" w:type="dxa"/>
+            <w:tcW w:w="5763" w:type="dxa"/>
             <w:tcBorders>
               <w:top w:val="single" w:sz="2" w:space="0" w:color="DDDDDD"/>
               <w:start w:val="single" w:sz="2" w:space="0" w:color="DDDDDD"/>
@@ -22252,7 +22312,7 @@
         </w:trPr>
         <w:tc>
           <w:tcPr>
-            <w:tcW w:w="3598" w:type="dxa"/>
+            <w:tcW w:w="3597" w:type="dxa"/>
             <w:tcBorders>
               <w:top w:val="single" w:sz="2" w:space="0" w:color="DDDDDD"/>
               <w:start w:val="single" w:sz="2" w:space="0" w:color="DDDDDD"/>
@@ -22296,7 +22356,7 @@
         </w:tc>
         <w:tc>
           <w:tcPr>
-            <w:tcW w:w="5762" w:type="dxa"/>
+            <w:tcW w:w="5763" w:type="dxa"/>
             <w:tcBorders>
               <w:top w:val="single" w:sz="2" w:space="0" w:color="DDDDDD"/>
               <w:start w:val="single" w:sz="2" w:space="0" w:color="DDDDDD"/>
@@ -22346,7 +22406,7 @@
         </w:trPr>
         <w:tc>
           <w:tcPr>
-            <w:tcW w:w="3598" w:type="dxa"/>
+            <w:tcW w:w="3597" w:type="dxa"/>
             <w:tcBorders>
               <w:top w:val="single" w:sz="2" w:space="0" w:color="DDDDDD"/>
               <w:start w:val="single" w:sz="2" w:space="0" w:color="DDDDDD"/>
@@ -22390,7 +22450,7 @@
         </w:tc>
         <w:tc>
           <w:tcPr>
-            <w:tcW w:w="5762" w:type="dxa"/>
+            <w:tcW w:w="5763" w:type="dxa"/>
             <w:tcBorders>
               <w:top w:val="single" w:sz="2" w:space="0" w:color="DDDDDD"/>
               <w:start w:val="single" w:sz="2" w:space="0" w:color="DDDDDD"/>
@@ -22497,8 +22557,8 @@
         </w:tblCellMar>
       </w:tblPr>
       <w:tblGrid>
-        <w:gridCol w:w="3598"/>
-        <w:gridCol w:w="5762"/>
+        <w:gridCol w:w="3597"/>
+        <w:gridCol w:w="5763"/>
       </w:tblGrid>
       <w:tr>
         <w:trPr>
@@ -22507,7 +22567,7 @@
         </w:trPr>
         <w:tc>
           <w:tcPr>
-            <w:tcW w:w="3598" w:type="dxa"/>
+            <w:tcW w:w="3597" w:type="dxa"/>
             <w:tcBorders>
               <w:top w:val="single" w:sz="2" w:space="0" w:color="DDDDDD"/>
               <w:start w:val="single" w:sz="2" w:space="0" w:color="DDDDDD"/>
@@ -22550,7 +22610,7 @@
         </w:tc>
         <w:tc>
           <w:tcPr>
-            <w:tcW w:w="5762" w:type="dxa"/>
+            <w:tcW w:w="5763" w:type="dxa"/>
             <w:tcBorders>
               <w:top w:val="single" w:sz="2" w:space="0" w:color="DDDDDD"/>
               <w:start w:val="single" w:sz="2" w:space="0" w:color="DDDDDD"/>
@@ -22600,7 +22660,7 @@
         </w:trPr>
         <w:tc>
           <w:tcPr>
-            <w:tcW w:w="3598" w:type="dxa"/>
+            <w:tcW w:w="3597" w:type="dxa"/>
             <w:tcBorders>
               <w:top w:val="single" w:sz="2" w:space="0" w:color="DDDDDD"/>
               <w:start w:val="single" w:sz="2" w:space="0" w:color="DDDDDD"/>
@@ -22644,7 +22704,7 @@
         </w:tc>
         <w:tc>
           <w:tcPr>
-            <w:tcW w:w="5762" w:type="dxa"/>
+            <w:tcW w:w="5763" w:type="dxa"/>
             <w:tcBorders>
               <w:top w:val="single" w:sz="2" w:space="0" w:color="DDDDDD"/>
               <w:start w:val="single" w:sz="2" w:space="0" w:color="DDDDDD"/>
@@ -22694,7 +22754,7 @@
         </w:trPr>
         <w:tc>
           <w:tcPr>
-            <w:tcW w:w="3598" w:type="dxa"/>
+            <w:tcW w:w="3597" w:type="dxa"/>
             <w:tcBorders>
               <w:top w:val="single" w:sz="2" w:space="0" w:color="DDDDDD"/>
               <w:start w:val="single" w:sz="2" w:space="0" w:color="DDDDDD"/>
@@ -22737,7 +22797,7 @@
         </w:tc>
         <w:tc>
           <w:tcPr>
-            <w:tcW w:w="5762" w:type="dxa"/>
+            <w:tcW w:w="5763" w:type="dxa"/>
             <w:tcBorders>
               <w:top w:val="single" w:sz="2" w:space="0" w:color="DDDDDD"/>
               <w:start w:val="single" w:sz="2" w:space="0" w:color="DDDDDD"/>
@@ -22787,7 +22847,7 @@
         </w:trPr>
         <w:tc>
           <w:tcPr>
-            <w:tcW w:w="3598" w:type="dxa"/>
+            <w:tcW w:w="3597" w:type="dxa"/>
             <w:tcBorders>
               <w:top w:val="single" w:sz="2" w:space="0" w:color="DDDDDD"/>
               <w:start w:val="single" w:sz="2" w:space="0" w:color="DDDDDD"/>
@@ -22831,7 +22891,7 @@
         </w:tc>
         <w:tc>
           <w:tcPr>
-            <w:tcW w:w="5762" w:type="dxa"/>
+            <w:tcW w:w="5763" w:type="dxa"/>
             <w:tcBorders>
               <w:top w:val="single" w:sz="2" w:space="0" w:color="DDDDDD"/>
               <w:start w:val="single" w:sz="2" w:space="0" w:color="DDDDDD"/>
@@ -22881,7 +22941,7 @@
         </w:trPr>
         <w:tc>
           <w:tcPr>
-            <w:tcW w:w="3598" w:type="dxa"/>
+            <w:tcW w:w="3597" w:type="dxa"/>
             <w:tcBorders>
               <w:top w:val="single" w:sz="2" w:space="0" w:color="DDDDDD"/>
               <w:start w:val="single" w:sz="2" w:space="0" w:color="DDDDDD"/>
@@ -22925,7 +22985,7 @@
         </w:tc>
         <w:tc>
           <w:tcPr>
-            <w:tcW w:w="5762" w:type="dxa"/>
+            <w:tcW w:w="5763" w:type="dxa"/>
             <w:tcBorders>
               <w:top w:val="single" w:sz="2" w:space="0" w:color="DDDDDD"/>
               <w:start w:val="single" w:sz="2" w:space="0" w:color="DDDDDD"/>
@@ -22975,7 +23035,7 @@
         </w:trPr>
         <w:tc>
           <w:tcPr>
-            <w:tcW w:w="3598" w:type="dxa"/>
+            <w:tcW w:w="3597" w:type="dxa"/>
             <w:tcBorders>
               <w:top w:val="single" w:sz="2" w:space="0" w:color="DDDDDD"/>
               <w:start w:val="single" w:sz="2" w:space="0" w:color="DDDDDD"/>
@@ -23019,7 +23079,7 @@
         </w:tc>
         <w:tc>
           <w:tcPr>
-            <w:tcW w:w="5762" w:type="dxa"/>
+            <w:tcW w:w="5763" w:type="dxa"/>
             <w:tcBorders>
               <w:top w:val="single" w:sz="2" w:space="0" w:color="DDDDDD"/>
               <w:start w:val="single" w:sz="2" w:space="0" w:color="DDDDDD"/>
@@ -23069,7 +23129,7 @@
         </w:trPr>
         <w:tc>
           <w:tcPr>
-            <w:tcW w:w="3598" w:type="dxa"/>
+            <w:tcW w:w="3597" w:type="dxa"/>
             <w:tcBorders>
               <w:top w:val="single" w:sz="2" w:space="0" w:color="DDDDDD"/>
               <w:start w:val="single" w:sz="2" w:space="0" w:color="DDDDDD"/>
@@ -23113,7 +23173,7 @@
         </w:tc>
         <w:tc>
           <w:tcPr>
-            <w:tcW w:w="5762" w:type="dxa"/>
+            <w:tcW w:w="5763" w:type="dxa"/>
             <w:tcBorders>
               <w:top w:val="single" w:sz="2" w:space="0" w:color="DDDDDD"/>
               <w:start w:val="single" w:sz="2" w:space="0" w:color="DDDDDD"/>
@@ -23163,7 +23223,7 @@
         </w:trPr>
         <w:tc>
           <w:tcPr>
-            <w:tcW w:w="3598" w:type="dxa"/>
+            <w:tcW w:w="3597" w:type="dxa"/>
             <w:tcBorders>
               <w:top w:val="single" w:sz="2" w:space="0" w:color="DDDDDD"/>
               <w:start w:val="single" w:sz="2" w:space="0" w:color="DDDDDD"/>
@@ -23207,7 +23267,7 @@
         </w:tc>
         <w:tc>
           <w:tcPr>
-            <w:tcW w:w="5762" w:type="dxa"/>
+            <w:tcW w:w="5763" w:type="dxa"/>
             <w:tcBorders>
               <w:top w:val="single" w:sz="2" w:space="0" w:color="DDDDDD"/>
               <w:start w:val="single" w:sz="2" w:space="0" w:color="DDDDDD"/>
@@ -23314,8 +23374,8 @@
         </w:tblCellMar>
       </w:tblPr>
       <w:tblGrid>
-        <w:gridCol w:w="3598"/>
-        <w:gridCol w:w="5762"/>
+        <w:gridCol w:w="3597"/>
+        <w:gridCol w:w="5763"/>
       </w:tblGrid>
       <w:tr>
         <w:trPr>
@@ -23324,7 +23384,7 @@
         </w:trPr>
         <w:tc>
           <w:tcPr>
-            <w:tcW w:w="3598" w:type="dxa"/>
+            <w:tcW w:w="3597" w:type="dxa"/>
             <w:tcBorders>
               <w:top w:val="single" w:sz="2" w:space="0" w:color="DDDDDD"/>
               <w:start w:val="single" w:sz="2" w:space="0" w:color="DDDDDD"/>
@@ -23367,7 +23427,7 @@
         </w:tc>
         <w:tc>
           <w:tcPr>
-            <w:tcW w:w="5762" w:type="dxa"/>
+            <w:tcW w:w="5763" w:type="dxa"/>
             <w:tcBorders>
               <w:top w:val="single" w:sz="2" w:space="0" w:color="DDDDDD"/>
               <w:start w:val="single" w:sz="2" w:space="0" w:color="DDDDDD"/>
@@ -23417,7 +23477,7 @@
         </w:trPr>
         <w:tc>
           <w:tcPr>
-            <w:tcW w:w="3598" w:type="dxa"/>
+            <w:tcW w:w="3597" w:type="dxa"/>
             <w:tcBorders>
               <w:top w:val="single" w:sz="2" w:space="0" w:color="DDDDDD"/>
               <w:start w:val="single" w:sz="2" w:space="0" w:color="DDDDDD"/>
@@ -23461,7 +23521,7 @@
         </w:tc>
         <w:tc>
           <w:tcPr>
-            <w:tcW w:w="5762" w:type="dxa"/>
+            <w:tcW w:w="5763" w:type="dxa"/>
             <w:tcBorders>
               <w:top w:val="single" w:sz="2" w:space="0" w:color="DDDDDD"/>
               <w:start w:val="single" w:sz="2" w:space="0" w:color="DDDDDD"/>
@@ -23511,7 +23571,7 @@
         </w:trPr>
         <w:tc>
           <w:tcPr>
-            <w:tcW w:w="3598" w:type="dxa"/>
+            <w:tcW w:w="3597" w:type="dxa"/>
             <w:tcBorders>
               <w:top w:val="single" w:sz="2" w:space="0" w:color="DDDDDD"/>
               <w:start w:val="single" w:sz="2" w:space="0" w:color="DDDDDD"/>
@@ -23554,7 +23614,7 @@
         </w:tc>
         <w:tc>
           <w:tcPr>
-            <w:tcW w:w="5762" w:type="dxa"/>
+            <w:tcW w:w="5763" w:type="dxa"/>
             <w:tcBorders>
               <w:top w:val="single" w:sz="2" w:space="0" w:color="DDDDDD"/>
               <w:start w:val="single" w:sz="2" w:space="0" w:color="DDDDDD"/>
@@ -23604,7 +23664,7 @@
         </w:trPr>
         <w:tc>
           <w:tcPr>
-            <w:tcW w:w="3598" w:type="dxa"/>
+            <w:tcW w:w="3597" w:type="dxa"/>
             <w:tcBorders>
               <w:top w:val="single" w:sz="2" w:space="0" w:color="DDDDDD"/>
               <w:start w:val="single" w:sz="2" w:space="0" w:color="DDDDDD"/>
@@ -23648,7 +23708,7 @@
         </w:tc>
         <w:tc>
           <w:tcPr>
-            <w:tcW w:w="5762" w:type="dxa"/>
+            <w:tcW w:w="5763" w:type="dxa"/>
             <w:tcBorders>
               <w:top w:val="single" w:sz="2" w:space="0" w:color="DDDDDD"/>
               <w:start w:val="single" w:sz="2" w:space="0" w:color="DDDDDD"/>
@@ -23782,7 +23842,7 @@
     </w:r>
     <w:r>
       <w:rPr/>
-      <w:t>19</w:t>
+      <w:t>0</w:t>
     </w:r>
     <w:r>
       <w:rPr/>
@@ -23837,7 +23897,7 @@
     </w:r>
     <w:r>
       <w:rPr/>
-      <w:t>19</w:t>
+      <w:t>0</w:t>
     </w:r>
     <w:r>
       <w:rPr/>
@@ -25725,8 +25785,8 @@
       <w:u w:val="single" w:color="FFFFFF"/>
     </w:rPr>
   </w:style>
-  <w:style w:type="character" w:styleId="Bulletsuser">
-    <w:name w:val="Bullets (user)"/>
+  <w:style w:type="character" w:styleId="Bullets">
+    <w:name w:val="Bullets"/>
     <w:qFormat/>
     <w:rPr>
       <w:rFonts w:ascii="OpenSymbol" w:hAnsi="OpenSymbol" w:eastAsia="OpenSymbol" w:cs="OpenSymbol"/>

</xml_diff>

<commit_message>
Deploy 2026-04-08 07:00 — 5 file(s) updated
</commit_message>
<xml_diff>
--- a/Mohangraphy_Technical_Guide.docx
+++ b/Mohangraphy_Technical_Guide.docx
@@ -3495,6 +3495,57 @@
       </w:pPr>
       <w:r>
         <w:rPr>
+          <w:rFonts w:eastAsia="Arial Unicode MS" w:cs="Arial Unicode MS" w:ascii="Courier New" w:hAnsi="Courier New"/>
+          <w:b/>
+          <w:bCs/>
+          <w:i w:val="false"/>
+          <w:iCs w:val="false"/>
+          <w:caps w:val="false"/>
+          <w:smallCaps w:val="false"/>
+          <w:strike w:val="false"/>
+          <w:dstrike w:val="false"/>
+          <w:outline w:val="false"/>
+          <w:emboss w:val="false"/>
+          <w:imprint w:val="false"/>
+          <w:vanish w:val="false"/>
+          <w:color w:val="000000"/>
+          <w:spacing w:val="0"/>
+          <w:w w:val="100"/>
+          <w:kern w:val="0"/>
+          <w:position w:val="0"/>
+          <w:sz w:val="18"/>
+          <w:szCs w:val="18"/>
+          <w:u w:val="none" w:color="D4D4D4"/>
+          <w:shd w:fill="auto" w:val="clear"/>
+          <w:vertAlign w:val="baseline"/>
+          <w:lang w:val="en-US" w:eastAsia="zh-CN" w:bidi="hi-IN"/>
+        </w:rPr>
+        <w:t>cp ~/</w:t>
+      </w:r>
+      <w:r>
+        <w:rPr>
+          <w:rFonts w:ascii="Courier New" w:hAnsi="Courier New"/>
+          <w:outline w:val="false"/>
+          <w:color w:val="000000"/>
+          <w:sz w:val="18"/>
+          <w:szCs w:val="18"/>
+          <w:u w:val="none" w:color="D4D4D4"/>
+          <w:lang w:val="en-US"/>
+        </w:rPr>
+        <w:t>Downloads/curator.py /Users/ncm/Pictures/Mohangraphy/Scripts/</w:t>
+      </w:r>
+    </w:p>
+    <w:p>
+      <w:pPr>
+        <w:pStyle w:val="Heading2"/>
+        <w:widowControl w:val="false"/>
+        <w:spacing w:lineRule="auto" w:line="240" w:before="0" w:after="0"/>
+        <w:rPr>
+          <w:color w:val="000000"/>
+        </w:rPr>
+      </w:pPr>
+      <w:r>
+        <w:rPr>
           <w:rFonts w:ascii="Courier New" w:hAnsi="Courier New"/>
           <w:outline w:val="false"/>
           <w:color w:val="000000"/>
@@ -4019,22 +4070,6 @@
         <w:pStyle w:val="Heading2"/>
         <w:widowControl w:val="false"/>
         <w:spacing w:lineRule="auto" w:line="240" w:before="0" w:after="0"/>
-        <w:rPr/>
-      </w:pPr>
-      <w:r>
-        <w:rPr/>
-      </w:r>
-    </w:p>
-    <w:p>
-      <w:pPr>
-        <w:pStyle w:val="Heading2"/>
-        <w:widowControl w:val="false"/>
-        <w:spacing w:lineRule="auto" w:line="240" w:before="0" w:after="0"/>
-        <w:rPr>
-          <w:color w:val="000000"/>
-        </w:rPr>
-      </w:pPr>
-      <w:r>
         <w:rPr>
           <w:rFonts w:ascii="Courier New" w:hAnsi="Courier New"/>
           <w:outline w:val="false"/>
@@ -4044,6 +4079,89 @@
           <w:u w:val="none" w:color="D4D4D4"/>
           <w:lang w:val="en-US"/>
         </w:rPr>
+      </w:pPr>
+      <w:r>
+        <w:rPr>
+          <w:rFonts w:ascii="Courier New" w:hAnsi="Courier New"/>
+          <w:outline w:val="false"/>
+          <w:color w:val="000000"/>
+          <w:sz w:val="18"/>
+          <w:szCs w:val="18"/>
+          <w:u w:val="none" w:color="D4D4D4"/>
+          <w:lang w:val="en-US"/>
+        </w:rPr>
+      </w:r>
+    </w:p>
+    <w:p>
+      <w:pPr>
+        <w:pStyle w:val="Heading2"/>
+        <w:widowControl w:val="false"/>
+        <w:spacing w:lineRule="auto" w:line="240" w:before="0" w:after="0"/>
+        <w:rPr>
+          <w:color w:val="000000"/>
+        </w:rPr>
+      </w:pPr>
+      <w:r>
+        <w:rPr>
+          <w:rFonts w:ascii="Courier New" w:hAnsi="Courier New"/>
+          <w:outline w:val="false"/>
+          <w:color w:val="000000"/>
+          <w:sz w:val="18"/>
+          <w:szCs w:val="18"/>
+          <w:u w:val="none" w:color="D4D4D4"/>
+          <w:lang w:val="en-US"/>
+        </w:rPr>
+      </w:r>
+    </w:p>
+    <w:p>
+      <w:pPr>
+        <w:pStyle w:val="Heading2"/>
+        <w:widowControl w:val="false"/>
+        <w:spacing w:before="0" w:after="0"/>
+        <w:rPr>
+          <w:rFonts w:ascii="Courier New" w:hAnsi="Courier New"/>
+          <w:color w:val="000000"/>
+          <w:sz w:val="18"/>
+          <w:szCs w:val="18"/>
+          <w:u w:val="none" w:color="D4D4D4"/>
+          <w:lang w:val="en-US"/>
+        </w:rPr>
+      </w:pPr>
+      <w:r>
+        <w:rPr>
+          <w:rFonts w:ascii="Courier New" w:hAnsi="Courier New"/>
+          <w:color w:val="000000"/>
+          <w:sz w:val="18"/>
+          <w:szCs w:val="18"/>
+          <w:u w:val="none" w:color="D4D4D4"/>
+          <w:lang w:val="en-US"/>
+        </w:rPr>
+        <w:t>cp ~/Downloads/Claude_mohangraphy.py /Users/ncm/Pictures/Mohangraphy/Scripts/</w:t>
+      </w:r>
+    </w:p>
+    <w:p>
+      <w:pPr>
+        <w:pStyle w:val="Heading2"/>
+        <w:widowControl w:val="false"/>
+        <w:spacing w:before="0" w:after="0"/>
+        <w:rPr>
+          <w:rFonts w:ascii="Courier New" w:hAnsi="Courier New"/>
+          <w:color w:val="000000"/>
+          <w:sz w:val="18"/>
+          <w:szCs w:val="18"/>
+          <w:u w:val="none" w:color="D4D4D4"/>
+          <w:lang w:val="en-US"/>
+        </w:rPr>
+      </w:pPr>
+      <w:r>
+        <w:rPr>
+          <w:rFonts w:ascii="Courier New" w:hAnsi="Courier New"/>
+          <w:color w:val="000000"/>
+          <w:sz w:val="18"/>
+          <w:szCs w:val="18"/>
+          <w:u w:val="none" w:color="D4D4D4"/>
+          <w:lang w:val="en-US"/>
+        </w:rPr>
         <w:t>python3 /Users/ncm/Pictures/Mohangraphy/Scripts/Claude_mohangraphy.py</w:t>
       </w:r>
     </w:p>
@@ -4051,14 +4169,24 @@
       <w:pPr>
         <w:pStyle w:val="Heading2"/>
         <w:widowControl w:val="false"/>
-        <w:spacing w:lineRule="auto" w:line="240" w:before="0" w:after="0"/>
-        <w:rPr>
-          <w:color w:val="000000"/>
-        </w:rPr>
-      </w:pPr>
-      <w:r>
-        <w:rPr>
-          <w:color w:val="000000"/>
+        <w:spacing w:before="0" w:after="0"/>
+        <w:rPr>
+          <w:rFonts w:ascii="Courier New" w:hAnsi="Courier New"/>
+          <w:color w:val="000000"/>
+          <w:sz w:val="18"/>
+          <w:szCs w:val="18"/>
+          <w:u w:val="none" w:color="D4D4D4"/>
+          <w:lang w:val="en-US"/>
+        </w:rPr>
+      </w:pPr>
+      <w:r>
+        <w:rPr>
+          <w:rFonts w:ascii="Courier New" w:hAnsi="Courier New"/>
+          <w:color w:val="000000"/>
+          <w:sz w:val="18"/>
+          <w:szCs w:val="18"/>
+          <w:u w:val="none" w:color="D4D4D4"/>
+          <w:lang w:val="en-US"/>
         </w:rPr>
       </w:r>
     </w:p>
@@ -13277,67 +13405,7 @@
           <w:u w:val="none" w:color="D4D4D4"/>
           <w:lang w:val="en-US"/>
         </w:rPr>
-        <w:t>\n\n</w:t>
-      </w:r>
-      <w:r>
-        <w:rPr>
-          <w:rFonts w:ascii="Courier New" w:hAnsi="Courier New"/>
-          <w:outline w:val="false"/>
-          <w:color w:val="000000"/>
-          <w:sz w:val="18"/>
-          <w:szCs w:val="18"/>
-          <w:u w:val="none" w:color="D4D4D4"/>
-          <w:lang w:val="en-US"/>
-        </w:rPr>
-        <w:t xml:space="preserve">[photo: 2026-0324-Tadoba-NCM-9463.JPG | The </w:t>
-      </w:r>
-      <w:r>
-        <w:rPr>
-          <w:rFonts w:ascii="Courier New" w:hAnsi="Courier New"/>
-          <w:outline w:val="false"/>
-          <w:color w:val="000000"/>
-          <w:sz w:val="18"/>
-          <w:szCs w:val="18"/>
-          <w:u w:val="none" w:color="D4D4D4"/>
-          <w:lang w:val="en-US"/>
-        </w:rPr>
-        <w:t>G</w:t>
-      </w:r>
-      <w:r>
-        <w:rPr>
-          <w:rFonts w:ascii="Courier New" w:hAnsi="Courier New"/>
-          <w:outline w:val="false"/>
-          <w:color w:val="000000"/>
-          <w:sz w:val="18"/>
-          <w:szCs w:val="18"/>
-          <w:u w:val="none" w:color="D4D4D4"/>
-          <w:lang w:val="en-US"/>
-        </w:rPr>
-        <w:t>o</w:t>
-      </w:r>
-      <w:r>
-        <w:rPr>
-          <w:rFonts w:ascii="Courier New" w:hAnsi="Courier New"/>
-          <w:outline w:val="false"/>
-          <w:color w:val="000000"/>
-          <w:sz w:val="18"/>
-          <w:szCs w:val="18"/>
-          <w:u w:val="none" w:color="D4D4D4"/>
-          <w:lang w:val="en-US"/>
-        </w:rPr>
-        <w:t>al: The Tiger</w:t>
-      </w:r>
-      <w:r>
-        <w:rPr>
-          <w:rFonts w:ascii="Courier New" w:hAnsi="Courier New"/>
-          <w:outline w:val="false"/>
-          <w:color w:val="000000"/>
-          <w:sz w:val="18"/>
-          <w:szCs w:val="18"/>
-          <w:u w:val="none" w:color="D4D4D4"/>
-          <w:lang w:val="en-US"/>
-        </w:rPr>
-        <w:t>]\n\n</w:t>
+        <w:t>\n\n[photo: 2026-0324-Tadoba-NCM-9463.JPG | The Goal: The Tiger]\n\n</w:t>
       </w:r>
     </w:p>
     <w:p>
@@ -25785,8 +25853,8 @@
       <w:u w:val="single" w:color="FFFFFF"/>
     </w:rPr>
   </w:style>
-  <w:style w:type="character" w:styleId="Bullets">
-    <w:name w:val="Bullets"/>
+  <w:style w:type="character" w:styleId="Bulletsuser">
+    <w:name w:val="Bullets (user)"/>
     <w:qFormat/>
     <w:rPr>
       <w:rFonts w:ascii="OpenSymbol" w:hAnsi="OpenSymbol" w:eastAsia="OpenSymbol" w:cs="OpenSymbol"/>

</xml_diff>

<commit_message>
Deploy 2026-04-09 08:20 — 5 file(s) updated
</commit_message>
<xml_diff>
--- a/Mohangraphy_Technical_Guide.docx
+++ b/Mohangraphy_Technical_Guide.docx
@@ -4103,13 +4103,7 @@
       </w:pPr>
       <w:r>
         <w:rPr>
-          <w:rFonts w:ascii="Courier New" w:hAnsi="Courier New"/>
-          <w:outline w:val="false"/>
-          <w:color w:val="000000"/>
-          <w:sz w:val="18"/>
-          <w:szCs w:val="18"/>
-          <w:u w:val="none" w:color="D4D4D4"/>
-          <w:lang w:val="en-US"/>
+          <w:color w:val="000000"/>
         </w:rPr>
       </w:r>
     </w:p>
@@ -16164,13 +16158,15 @@
       <w:pPr>
         <w:pStyle w:val="Heading2"/>
         <w:spacing w:lineRule="auto" w:line="240" w:before="0" w:after="0"/>
-        <w:rPr/>
+        <w:rPr>
+          <w:color w:val="000000"/>
+        </w:rPr>
       </w:pPr>
       <w:r>
         <w:rPr>
           <w:rFonts w:ascii="Courier New" w:hAnsi="Courier New"/>
           <w:outline w:val="false"/>
-          <w:color w:val="D4D4D4"/>
+          <w:color w:val="000000"/>
           <w:sz w:val="18"/>
           <w:szCs w:val="18"/>
           <w:u w:val="none" w:color="D4D4D4"/>
@@ -16183,10 +16179,14 @@
       <w:pPr>
         <w:pStyle w:val="Heading2"/>
         <w:spacing w:lineRule="auto" w:line="240" w:before="0" w:after="0"/>
-        <w:rPr/>
-      </w:pPr>
-      <w:r>
-        <w:rPr/>
+        <w:rPr>
+          <w:color w:val="000000"/>
+        </w:rPr>
+      </w:pPr>
+      <w:r>
+        <w:rPr>
+          <w:color w:val="000000"/>
+        </w:rPr>
       </w:r>
     </w:p>
     <w:p>
@@ -17120,13 +17120,15 @@
       <w:pPr>
         <w:pStyle w:val="Heading2"/>
         <w:spacing w:lineRule="auto" w:line="240" w:before="0" w:after="0"/>
-        <w:rPr/>
+        <w:rPr>
+          <w:color w:val="000000"/>
+        </w:rPr>
       </w:pPr>
       <w:r>
         <w:rPr>
           <w:rFonts w:ascii="Courier New" w:hAnsi="Courier New"/>
           <w:outline w:val="false"/>
-          <w:color w:val="D4D4D4"/>
+          <w:color w:val="000000"/>
           <w:sz w:val="18"/>
           <w:szCs w:val="18"/>
           <w:u w:val="none" w:color="D4D4D4"/>
@@ -17139,23 +17141,29 @@
       <w:pPr>
         <w:pStyle w:val="Heading2"/>
         <w:spacing w:lineRule="auto" w:line="240" w:before="0" w:after="0"/>
-        <w:rPr/>
-      </w:pPr>
-      <w:r>
-        <w:rPr/>
-      </w:r>
-    </w:p>
-    <w:p>
-      <w:pPr>
-        <w:pStyle w:val="Heading2"/>
-        <w:spacing w:lineRule="auto" w:line="240" w:before="0" w:after="0"/>
-        <w:rPr/>
+        <w:rPr>
+          <w:color w:val="000000"/>
+        </w:rPr>
+      </w:pPr>
+      <w:r>
+        <w:rPr>
+          <w:color w:val="000000"/>
+        </w:rPr>
+      </w:r>
+    </w:p>
+    <w:p>
+      <w:pPr>
+        <w:pStyle w:val="Heading2"/>
+        <w:spacing w:lineRule="auto" w:line="240" w:before="0" w:after="0"/>
+        <w:rPr>
+          <w:color w:val="000000"/>
+        </w:rPr>
       </w:pPr>
       <w:r>
         <w:rPr>
           <w:rFonts w:ascii="Courier New" w:hAnsi="Courier New"/>
           <w:outline w:val="false"/>
-          <w:color w:val="D4D4D4"/>
+          <w:color w:val="000000"/>
           <w:sz w:val="18"/>
           <w:szCs w:val="18"/>
           <w:u w:val="none" w:color="D4D4D4"/>
@@ -17168,13 +17176,15 @@
       <w:pPr>
         <w:pStyle w:val="Heading2"/>
         <w:spacing w:lineRule="auto" w:line="240" w:before="0" w:after="0"/>
-        <w:rPr/>
+        <w:rPr>
+          <w:color w:val="000000"/>
+        </w:rPr>
       </w:pPr>
       <w:r>
         <w:rPr>
           <w:rFonts w:ascii="Courier New" w:hAnsi="Courier New"/>
           <w:outline w:val="false"/>
-          <w:color w:val="D4D4D4"/>
+          <w:color w:val="000000"/>
           <w:sz w:val="18"/>
           <w:szCs w:val="18"/>
           <w:u w:val="none" w:color="D4D4D4"/>
@@ -17189,7 +17199,7 @@
           <w:i w:val="false"/>
           <w:iCs w:val="false"/>
           <w:outline w:val="false"/>
-          <w:color w:val="D4D4D4"/>
+          <w:color w:val="000000"/>
           <w:sz w:val="18"/>
           <w:szCs w:val="18"/>
           <w:u w:val="none" w:color="D4D4D4"/>
@@ -17200,7 +17210,7 @@
         <w:rPr>
           <w:rFonts w:ascii="Courier New" w:hAnsi="Courier New"/>
           <w:outline w:val="false"/>
-          <w:color w:val="D4D4D4"/>
+          <w:color w:val="000000"/>
           <w:sz w:val="18"/>
           <w:szCs w:val="18"/>
           <w:u w:val="none" w:color="D4D4D4"/>
@@ -17211,7 +17221,7 @@
         <w:rPr>
           <w:rFonts w:ascii="Courier New" w:hAnsi="Courier New"/>
           <w:outline w:val="false"/>
-          <w:color w:val="D4D4D4"/>
+          <w:color w:val="000000"/>
           <w:sz w:val="18"/>
           <w:szCs w:val="18"/>
           <w:u w:val="none" w:color="D4D4D4"/>
@@ -17224,23 +17234,29 @@
       <w:pPr>
         <w:pStyle w:val="Heading2"/>
         <w:spacing w:lineRule="auto" w:line="240" w:before="0" w:after="0"/>
-        <w:rPr/>
-      </w:pPr>
-      <w:r>
-        <w:rPr/>
-      </w:r>
-    </w:p>
-    <w:p>
-      <w:pPr>
-        <w:pStyle w:val="Heading2"/>
-        <w:spacing w:lineRule="auto" w:line="240" w:before="0" w:after="0"/>
-        <w:rPr/>
+        <w:rPr>
+          <w:color w:val="000000"/>
+        </w:rPr>
+      </w:pPr>
+      <w:r>
+        <w:rPr>
+          <w:color w:val="000000"/>
+        </w:rPr>
+      </w:r>
+    </w:p>
+    <w:p>
+      <w:pPr>
+        <w:pStyle w:val="Heading2"/>
+        <w:spacing w:lineRule="auto" w:line="240" w:before="0" w:after="0"/>
+        <w:rPr>
+          <w:color w:val="000000"/>
+        </w:rPr>
       </w:pPr>
       <w:r>
         <w:rPr>
           <w:rFonts w:ascii="Courier New" w:hAnsi="Courier New"/>
           <w:outline w:val="false"/>
-          <w:color w:val="D4D4D4"/>
+          <w:color w:val="000000"/>
           <w:sz w:val="18"/>
           <w:szCs w:val="18"/>
           <w:u w:val="none" w:color="D4D4D4"/>
@@ -17253,13 +17269,15 @@
       <w:pPr>
         <w:pStyle w:val="Heading2"/>
         <w:spacing w:lineRule="auto" w:line="240" w:before="0" w:after="0"/>
-        <w:rPr/>
+        <w:rPr>
+          <w:color w:val="000000"/>
+        </w:rPr>
       </w:pPr>
       <w:r>
         <w:rPr>
           <w:rFonts w:ascii="Courier New" w:hAnsi="Courier New"/>
           <w:outline w:val="false"/>
-          <w:color w:val="D4D4D4"/>
+          <w:color w:val="000000"/>
           <w:sz w:val="18"/>
           <w:szCs w:val="18"/>
           <w:u w:val="none" w:color="D4D4D4"/>
@@ -17271,7 +17289,7 @@
         <w:rPr>
           <w:rFonts w:ascii="Courier New" w:hAnsi="Courier New"/>
           <w:outline w:val="false"/>
-          <w:color w:val="D4D4D4"/>
+          <w:color w:val="000000"/>
           <w:sz w:val="18"/>
           <w:szCs w:val="18"/>
           <w:u w:val="none" w:color="D4D4D4"/>
@@ -17283,7 +17301,7 @@
         <w:rPr>
           <w:rFonts w:ascii="Courier New" w:hAnsi="Courier New"/>
           <w:outline w:val="false"/>
-          <w:color w:val="D4D4D4"/>
+          <w:color w:val="000000"/>
           <w:sz w:val="18"/>
           <w:szCs w:val="18"/>
           <w:u w:val="none" w:color="D4D4D4"/>
@@ -17295,13 +17313,15 @@
       <w:pPr>
         <w:pStyle w:val="Heading2"/>
         <w:spacing w:lineRule="auto" w:line="240" w:before="0" w:after="0"/>
-        <w:rPr/>
+        <w:rPr>
+          <w:color w:val="000000"/>
+        </w:rPr>
       </w:pPr>
       <w:r>
         <w:rPr>
           <w:rFonts w:ascii="Courier New" w:hAnsi="Courier New"/>
           <w:outline w:val="false"/>
-          <w:color w:val="D4D4D4"/>
+          <w:color w:val="000000"/>
           <w:sz w:val="18"/>
           <w:szCs w:val="18"/>
           <w:u w:val="none" w:color="D4D4D4"/>
@@ -17313,7 +17333,7 @@
         <w:rPr>
           <w:rFonts w:ascii="Courier New" w:hAnsi="Courier New"/>
           <w:outline w:val="false"/>
-          <w:color w:val="D4D4D4"/>
+          <w:color w:val="000000"/>
           <w:sz w:val="18"/>
           <w:szCs w:val="18"/>
           <w:u w:val="none" w:color="D4D4D4"/>
@@ -17326,13 +17346,15 @@
       <w:pPr>
         <w:pStyle w:val="Heading2"/>
         <w:spacing w:lineRule="auto" w:line="240" w:before="0" w:after="0"/>
-        <w:rPr/>
+        <w:rPr>
+          <w:color w:val="000000"/>
+        </w:rPr>
       </w:pPr>
       <w:r>
         <w:rPr>
           <w:rFonts w:ascii="Courier New" w:hAnsi="Courier New"/>
           <w:outline w:val="false"/>
-          <w:color w:val="D4D4D4"/>
+          <w:color w:val="000000"/>
           <w:sz w:val="18"/>
           <w:szCs w:val="18"/>
           <w:u w:val="none" w:color="D4D4D4"/>
@@ -17344,7 +17366,7 @@
         <w:rPr>
           <w:rFonts w:ascii="Courier New" w:hAnsi="Courier New"/>
           <w:outline w:val="false"/>
-          <w:color w:val="D4D4D4"/>
+          <w:color w:val="000000"/>
           <w:sz w:val="18"/>
           <w:szCs w:val="18"/>
           <w:u w:val="none" w:color="D4D4D4"/>
@@ -17357,13 +17379,15 @@
       <w:pPr>
         <w:pStyle w:val="Heading2"/>
         <w:spacing w:lineRule="auto" w:line="240" w:before="0" w:after="0"/>
-        <w:rPr/>
+        <w:rPr>
+          <w:color w:val="000000"/>
+        </w:rPr>
       </w:pPr>
       <w:r>
         <w:rPr>
           <w:rFonts w:ascii="Courier New" w:hAnsi="Courier New"/>
           <w:outline w:val="false"/>
-          <w:color w:val="D4D4D4"/>
+          <w:color w:val="000000"/>
           <w:sz w:val="18"/>
           <w:szCs w:val="18"/>
           <w:u w:val="none" w:color="D4D4D4"/>
@@ -17375,7 +17399,7 @@
         <w:rPr>
           <w:rFonts w:ascii="Courier New" w:hAnsi="Courier New"/>
           <w:outline w:val="false"/>
-          <w:color w:val="D4D4D4"/>
+          <w:color w:val="000000"/>
           <w:sz w:val="18"/>
           <w:szCs w:val="18"/>
           <w:u w:val="none" w:color="D4D4D4"/>
@@ -17388,23 +17412,29 @@
       <w:pPr>
         <w:pStyle w:val="Heading2"/>
         <w:spacing w:lineRule="auto" w:line="240" w:before="0" w:after="0"/>
-        <w:rPr/>
-      </w:pPr>
-      <w:r>
-        <w:rPr/>
-      </w:r>
-    </w:p>
-    <w:p>
-      <w:pPr>
-        <w:pStyle w:val="Heading2"/>
-        <w:spacing w:lineRule="auto" w:line="240" w:before="0" w:after="0"/>
-        <w:rPr/>
+        <w:rPr>
+          <w:color w:val="000000"/>
+        </w:rPr>
+      </w:pPr>
+      <w:r>
+        <w:rPr>
+          <w:color w:val="000000"/>
+        </w:rPr>
+      </w:r>
+    </w:p>
+    <w:p>
+      <w:pPr>
+        <w:pStyle w:val="Heading2"/>
+        <w:spacing w:lineRule="auto" w:line="240" w:before="0" w:after="0"/>
+        <w:rPr>
+          <w:color w:val="000000"/>
+        </w:rPr>
       </w:pPr>
       <w:r>
         <w:rPr>
           <w:rFonts w:ascii="Courier New" w:hAnsi="Courier New"/>
           <w:outline w:val="false"/>
-          <w:color w:val="D4D4D4"/>
+          <w:color w:val="000000"/>
           <w:sz w:val="18"/>
           <w:szCs w:val="18"/>
           <w:u w:val="none" w:color="D4D4D4"/>
@@ -17417,13 +17447,15 @@
       <w:pPr>
         <w:pStyle w:val="Heading2"/>
         <w:spacing w:lineRule="auto" w:line="240" w:before="0" w:after="0"/>
-        <w:rPr/>
+        <w:rPr>
+          <w:color w:val="000000"/>
+        </w:rPr>
       </w:pPr>
       <w:r>
         <w:rPr>
           <w:rFonts w:ascii="Courier New" w:hAnsi="Courier New"/>
           <w:outline w:val="false"/>
-          <w:color w:val="D4D4D4"/>
+          <w:color w:val="000000"/>
           <w:sz w:val="18"/>
           <w:szCs w:val="18"/>
           <w:u w:val="none" w:color="D4D4D4"/>
@@ -17438,7 +17470,7 @@
           <w:i w:val="false"/>
           <w:iCs w:val="false"/>
           <w:outline w:val="false"/>
-          <w:color w:val="D4D4D4"/>
+          <w:color w:val="000000"/>
           <w:sz w:val="18"/>
           <w:szCs w:val="18"/>
           <w:u w:val="none" w:color="D4D4D4"/>
@@ -17449,7 +17481,7 @@
         <w:rPr>
           <w:rFonts w:ascii="Courier New" w:hAnsi="Courier New"/>
           <w:outline w:val="false"/>
-          <w:color w:val="D4D4D4"/>
+          <w:color w:val="000000"/>
           <w:sz w:val="18"/>
           <w:szCs w:val="18"/>
           <w:u w:val="none" w:color="D4D4D4"/>
@@ -17460,7 +17492,7 @@
         <w:rPr>
           <w:rFonts w:ascii="Courier New" w:hAnsi="Courier New"/>
           <w:outline w:val="false"/>
-          <w:color w:val="D4D4D4"/>
+          <w:color w:val="000000"/>
           <w:sz w:val="18"/>
           <w:szCs w:val="18"/>
           <w:u w:val="none" w:color="D4D4D4"/>
@@ -17473,13 +17505,15 @@
       <w:pPr>
         <w:pStyle w:val="Heading2"/>
         <w:spacing w:lineRule="auto" w:line="240" w:before="0" w:after="0"/>
-        <w:rPr/>
+        <w:rPr>
+          <w:color w:val="000000"/>
+        </w:rPr>
       </w:pPr>
       <w:r>
         <w:rPr>
           <w:rFonts w:ascii="Courier New" w:hAnsi="Courier New"/>
           <w:outline w:val="false"/>
-          <w:color w:val="D4D4D4"/>
+          <w:color w:val="000000"/>
           <w:sz w:val="18"/>
           <w:szCs w:val="18"/>
           <w:u w:val="none" w:color="D4D4D4"/>
@@ -17494,7 +17528,7 @@
           <w:i w:val="false"/>
           <w:iCs w:val="false"/>
           <w:outline w:val="false"/>
-          <w:color w:val="D4D4D4"/>
+          <w:color w:val="000000"/>
           <w:sz w:val="18"/>
           <w:szCs w:val="18"/>
           <w:u w:val="none" w:color="D4D4D4"/>
@@ -17505,7 +17539,7 @@
         <w:rPr>
           <w:rFonts w:ascii="Courier New" w:hAnsi="Courier New"/>
           <w:outline w:val="false"/>
-          <w:color w:val="D4D4D4"/>
+          <w:color w:val="000000"/>
           <w:sz w:val="18"/>
           <w:szCs w:val="18"/>
           <w:u w:val="none" w:color="D4D4D4"/>
@@ -17516,7 +17550,7 @@
         <w:rPr>
           <w:rFonts w:ascii="Courier New" w:hAnsi="Courier New"/>
           <w:outline w:val="false"/>
-          <w:color w:val="D4D4D4"/>
+          <w:color w:val="000000"/>
           <w:sz w:val="18"/>
           <w:szCs w:val="18"/>
           <w:u w:val="none" w:color="D4D4D4"/>
@@ -17529,13 +17563,15 @@
       <w:pPr>
         <w:pStyle w:val="Heading2"/>
         <w:spacing w:lineRule="auto" w:line="240" w:before="0" w:after="0"/>
-        <w:rPr/>
+        <w:rPr>
+          <w:color w:val="000000"/>
+        </w:rPr>
       </w:pPr>
       <w:r>
         <w:rPr>
           <w:rFonts w:ascii="Courier New" w:hAnsi="Courier New"/>
           <w:outline w:val="false"/>
-          <w:color w:val="D4D4D4"/>
+          <w:color w:val="000000"/>
           <w:sz w:val="18"/>
           <w:szCs w:val="18"/>
           <w:u w:val="none" w:color="D4D4D4"/>
@@ -17550,7 +17586,7 @@
           <w:i w:val="false"/>
           <w:iCs w:val="false"/>
           <w:outline w:val="false"/>
-          <w:color w:val="D4D4D4"/>
+          <w:color w:val="000000"/>
           <w:sz w:val="18"/>
           <w:szCs w:val="18"/>
           <w:u w:val="none" w:color="D4D4D4"/>
@@ -17561,7 +17597,7 @@
         <w:rPr>
           <w:rFonts w:ascii="Courier New" w:hAnsi="Courier New"/>
           <w:outline w:val="false"/>
-          <w:color w:val="D4D4D4"/>
+          <w:color w:val="000000"/>
           <w:sz w:val="18"/>
           <w:szCs w:val="18"/>
           <w:u w:val="none" w:color="D4D4D4"/>
@@ -17572,7 +17608,7 @@
         <w:rPr>
           <w:rFonts w:ascii="Courier New" w:hAnsi="Courier New"/>
           <w:outline w:val="false"/>
-          <w:color w:val="D4D4D4"/>
+          <w:color w:val="000000"/>
           <w:sz w:val="18"/>
           <w:szCs w:val="18"/>
           <w:u w:val="none" w:color="D4D4D4"/>
@@ -17585,10 +17621,14 @@
       <w:pPr>
         <w:pStyle w:val="Heading2"/>
         <w:spacing w:lineRule="auto" w:line="240" w:before="0" w:after="0"/>
-        <w:rPr/>
-      </w:pPr>
-      <w:r>
-        <w:rPr/>
+        <w:rPr>
+          <w:color w:val="000000"/>
+        </w:rPr>
+      </w:pPr>
+      <w:r>
+        <w:rPr>
+          <w:color w:val="000000"/>
+        </w:rPr>
       </w:r>
     </w:p>
     <w:p>
@@ -25853,8 +25893,8 @@
       <w:u w:val="single" w:color="FFFFFF"/>
     </w:rPr>
   </w:style>
-  <w:style w:type="character" w:styleId="Bulletsuser">
-    <w:name w:val="Bullets (user)"/>
+  <w:style w:type="character" w:styleId="Bullets">
+    <w:name w:val="Bullets"/>
     <w:qFormat/>
     <w:rPr>
       <w:rFonts w:ascii="OpenSymbol" w:hAnsi="OpenSymbol" w:eastAsia="OpenSymbol" w:cs="OpenSymbol"/>

</xml_diff>

<commit_message>
Deploy 2026-04-09 13:45 — 10 file(s) updated
</commit_message>
<xml_diff>
--- a/Mohangraphy_Technical_Guide.docx
+++ b/Mohangraphy_Technical_Guide.docx
@@ -3971,7 +3971,7 @@
       </w:tr>
       <w:tr>
         <w:trPr>
-          <w:trHeight w:val="520" w:hRule="atLeast"/>
+          <w:trHeight w:val="787" w:hRule="atLeast"/>
         </w:trPr>
         <w:tc>
           <w:tcPr>
@@ -11443,13 +11443,86 @@
     </w:tbl>
     <w:p>
       <w:pPr>
-        <w:pStyle w:val="Heading2"/>
-        <w:widowControl w:val="false"/>
-        <w:spacing w:lineRule="auto" w:line="240" w:before="0" w:after="0"/>
-        <w:rPr/>
-      </w:pPr>
-      <w:r>
-        <w:rPr/>
+        <w:pStyle w:val="PreformattedText"/>
+        <w:spacing w:lineRule="auto" w:line="240" w:before="0" w:after="0"/>
+        <w:rPr>
+          <w:rFonts w:ascii="Helvetica Neue" w:hAnsi="Helvetica Neue" w:eastAsia="Songti SC" w:cs="Arial Unicode MS"/>
+          <w:sz w:val="24"/>
+          <w:szCs w:val="24"/>
+        </w:rPr>
+      </w:pPr>
+      <w:r>
+        <w:rPr/>
+      </w:r>
+    </w:p>
+    <w:p>
+      <w:pPr>
+        <w:pStyle w:val="PreformattedText"/>
+        <w:spacing w:lineRule="auto" w:line="240" w:before="0" w:after="0"/>
+        <w:rPr>
+          <w:rFonts w:ascii="Helvetica Neue" w:hAnsi="Helvetica Neue" w:eastAsia="Songti SC" w:cs="Arial Unicode MS"/>
+          <w:sz w:val="24"/>
+          <w:szCs w:val="24"/>
+        </w:rPr>
+      </w:pPr>
+      <w:r>
+        <w:rPr/>
+      </w:r>
+    </w:p>
+    <w:p>
+      <w:pPr>
+        <w:pStyle w:val="PreformattedText"/>
+        <w:spacing w:lineRule="auto" w:line="240" w:before="0" w:after="0"/>
+        <w:rPr>
+          <w:rFonts w:ascii="Helvetica Neue" w:hAnsi="Helvetica Neue" w:eastAsia="Songti SC" w:cs="Arial Unicode MS"/>
+          <w:sz w:val="24"/>
+          <w:szCs w:val="24"/>
+        </w:rPr>
+      </w:pPr>
+      <w:r>
+        <w:rPr>
+          <w:rStyle w:val="SourceText"/>
+          <w:rFonts w:ascii="Helvetica" w:hAnsi="Helvetica"/>
+          <w:color w:val="14181F"/>
+          <w:sz w:val="20"/>
+          <w:szCs w:val="20"/>
+          <w:shd w:fill="auto" w:val="clear"/>
+        </w:rPr>
+        <w:t>Always ensure the following script is run before you edit tags:</w:t>
+      </w:r>
+    </w:p>
+    <w:p>
+      <w:pPr>
+        <w:pStyle w:val="PreformattedText"/>
+        <w:spacing w:lineRule="auto" w:line="240" w:before="0" w:after="0"/>
+        <w:rPr>
+          <w:rFonts w:ascii="Helvetica Neue" w:hAnsi="Helvetica Neue" w:eastAsia="Songti SC" w:cs="Arial Unicode MS"/>
+          <w:sz w:val="24"/>
+          <w:szCs w:val="24"/>
+        </w:rPr>
+      </w:pPr>
+      <w:r>
+        <w:rPr/>
+      </w:r>
+    </w:p>
+    <w:p>
+      <w:pPr>
+        <w:pStyle w:val="PreformattedText"/>
+        <w:spacing w:lineRule="auto" w:line="240" w:before="0" w:after="0"/>
+        <w:rPr/>
+      </w:pPr>
+      <w:r>
+        <w:rPr>
+          <w:rStyle w:val="SourceText"/>
+          <w:rFonts w:ascii="Helvetica" w:hAnsi="Helvetica"/>
+          <w:b/>
+          <w:bCs/>
+          <w:color w:val="14181F"/>
+          <w:sz w:val="20"/>
+          <w:szCs w:val="20"/>
+          <w:shd w:fill="auto" w:val="clear"/>
+        </w:rPr>
+        <w:t>python3 /Users/ncm/Pictures/Mohangraphy/Scripts/patch_tags.py</w:t>
       </w:r>
     </w:p>
     <w:p>
@@ -25893,8 +25966,8 @@
       <w:u w:val="single" w:color="FFFFFF"/>
     </w:rPr>
   </w:style>
-  <w:style w:type="character" w:styleId="Bullets">
-    <w:name w:val="Bullets"/>
+  <w:style w:type="character" w:styleId="Bulletsuser">
+    <w:name w:val="Bullets (user)"/>
     <w:qFormat/>
     <w:rPr>
       <w:rFonts w:ascii="OpenSymbol" w:hAnsi="OpenSymbol" w:eastAsia="OpenSymbol" w:cs="OpenSymbol"/>

</xml_diff>

<commit_message>
Deploy 2026-04-09 16:24 — 4 file(s) updated
</commit_message>
<xml_diff>
--- a/Mohangraphy_Technical_Guide.docx
+++ b/Mohangraphy_Technical_Guide.docx
@@ -4184,6 +4184,113 @@
         </w:rPr>
       </w:r>
     </w:p>
+    <w:p>
+      <w:pPr>
+        <w:pStyle w:val="Heading2"/>
+        <w:widowControl w:val="false"/>
+        <w:spacing w:before="0" w:after="0"/>
+        <w:rPr>
+          <w:rFonts w:ascii="Courier New" w:hAnsi="Courier New"/>
+          <w:color w:val="000000"/>
+          <w:sz w:val="18"/>
+          <w:szCs w:val="18"/>
+          <w:u w:val="none" w:color="D4D4D4"/>
+          <w:lang w:val="en-US"/>
+        </w:rPr>
+      </w:pPr>
+      <w:r>
+        <w:rPr>
+          <w:rFonts w:ascii="Courier New" w:hAnsi="Courier New"/>
+          <w:color w:val="000000"/>
+          <w:sz w:val="18"/>
+          <w:szCs w:val="18"/>
+          <w:u w:val="none" w:color="D4D4D4"/>
+          <w:lang w:val="en-US"/>
+        </w:rPr>
+      </w:r>
+    </w:p>
+    <w:p>
+      <w:pPr>
+        <w:pStyle w:val="BodyText"/>
+        <w:widowControl w:val="false"/>
+        <w:spacing w:before="0" w:after="0"/>
+        <w:rPr>
+          <w:rFonts w:ascii="Courier New" w:hAnsi="Courier New"/>
+          <w:color w:val="000000"/>
+          <w:sz w:val="18"/>
+          <w:szCs w:val="18"/>
+          <w:u w:val="none" w:color="D4D4D4"/>
+          <w:lang w:val="en-US"/>
+        </w:rPr>
+      </w:pPr>
+      <w:r>
+        <w:rPr>
+          <w:rFonts w:cs="Arial Unicode MS" w:ascii="Courier New" w:hAnsi="Courier New"/>
+          <w:b/>
+          <w:bCs/>
+          <w:color w:val="000000"/>
+          <w:sz w:val="18"/>
+          <w:szCs w:val="18"/>
+          <w:u w:val="none" w:color="D4D4D4"/>
+          <w:lang w:val="en-US" w:eastAsia="zh-CN" w:bidi="hi-IN"/>
+        </w:rPr>
+        <w:t xml:space="preserve">More minor corrections. When the </w:t>
+      </w:r>
+      <w:hyperlink r:id="rId2" w:tgtFrame="_blank">
+        <w:r>
+          <w:rPr>
+            <w:rStyle w:val="Hyperlink"/>
+            <w:rFonts w:cs="Arial Unicode MS" w:ascii="Courier New" w:hAnsi="Courier New"/>
+            <w:b/>
+            <w:bCs/>
+            <w:color w:val="000000"/>
+            <w:sz w:val="18"/>
+            <w:szCs w:val="18"/>
+            <w:u w:val="none" w:color="D4D4D4"/>
+            <w:lang w:val="en-US" w:eastAsia="zh-CN" w:bidi="hi-IN"/>
+          </w:rPr>
+          <w:t>curator.py</w:t>
+        </w:r>
+      </w:hyperlink>
+      <w:r>
+        <w:rPr>
+          <w:rFonts w:cs="Arial Unicode MS" w:ascii="Courier New" w:hAnsi="Courier New"/>
+          <w:b/>
+          <w:bCs/>
+          <w:color w:val="000000"/>
+          <w:sz w:val="18"/>
+          <w:szCs w:val="18"/>
+          <w:u w:val="none" w:color="D4D4D4"/>
+          <w:lang w:val="en-US" w:eastAsia="zh-CN" w:bidi="hi-IN"/>
+        </w:rPr>
+        <w:t xml:space="preserve"> script is run, it asks me to go through all the photos. It should only show the photos that have been added new and the photos that have not been tagged.</w:t>
+      </w:r>
+    </w:p>
+    <w:p>
+      <w:pPr>
+        <w:pStyle w:val="Heading2"/>
+        <w:widowControl w:val="false"/>
+        <w:spacing w:before="0" w:after="0"/>
+        <w:rPr>
+          <w:rFonts w:ascii="Courier New" w:hAnsi="Courier New"/>
+          <w:color w:val="000000"/>
+          <w:sz w:val="18"/>
+          <w:szCs w:val="18"/>
+          <w:u w:val="none" w:color="D4D4D4"/>
+          <w:lang w:val="en-US"/>
+        </w:rPr>
+      </w:pPr>
+      <w:r>
+        <w:rPr>
+          <w:rFonts w:ascii="Courier New" w:hAnsi="Courier New"/>
+          <w:color w:val="000000"/>
+          <w:sz w:val="18"/>
+          <w:szCs w:val="18"/>
+          <w:u w:val="none" w:color="D4D4D4"/>
+          <w:lang w:val="en-US"/>
+        </w:rPr>
+      </w:r>
+    </w:p>
     <w:tbl>
       <w:tblPr>
         <w:tblW w:w="9360" w:type="dxa"/>
@@ -11452,7 +11559,11 @@
         </w:rPr>
       </w:pPr>
       <w:r>
-        <w:rPr/>
+        <w:rPr>
+          <w:rFonts w:eastAsia="Songti SC" w:cs="Arial Unicode MS" w:ascii="Helvetica Neue" w:hAnsi="Helvetica Neue"/>
+          <w:sz w:val="24"/>
+          <w:szCs w:val="24"/>
+        </w:rPr>
       </w:r>
     </w:p>
     <w:p>
@@ -11466,7 +11577,11 @@
         </w:rPr>
       </w:pPr>
       <w:r>
-        <w:rPr/>
+        <w:rPr>
+          <w:rFonts w:eastAsia="Songti SC" w:cs="Arial Unicode MS" w:ascii="Helvetica Neue" w:hAnsi="Helvetica Neue"/>
+          <w:sz w:val="24"/>
+          <w:szCs w:val="24"/>
+        </w:rPr>
       </w:r>
     </w:p>
     <w:p>
@@ -11502,7 +11617,11 @@
         </w:rPr>
       </w:pPr>
       <w:r>
-        <w:rPr/>
+        <w:rPr>
+          <w:rFonts w:eastAsia="Songti SC" w:cs="Arial Unicode MS" w:ascii="Helvetica Neue" w:hAnsi="Helvetica Neue"/>
+          <w:sz w:val="24"/>
+          <w:szCs w:val="24"/>
+        </w:rPr>
       </w:r>
     </w:p>
     <w:p>
@@ -23946,12 +24065,12 @@
       </w:r>
     </w:p>
     <w:sectPr>
-      <w:headerReference w:type="even" r:id="rId2"/>
-      <w:headerReference w:type="default" r:id="rId3"/>
-      <w:headerReference w:type="first" r:id="rId4"/>
-      <w:footerReference w:type="even" r:id="rId5"/>
-      <w:footerReference w:type="default" r:id="rId6"/>
-      <w:footerReference w:type="first" r:id="rId7"/>
+      <w:headerReference w:type="even" r:id="rId3"/>
+      <w:headerReference w:type="default" r:id="rId4"/>
+      <w:headerReference w:type="first" r:id="rId5"/>
+      <w:footerReference w:type="even" r:id="rId6"/>
+      <w:footerReference w:type="default" r:id="rId7"/>
+      <w:footerReference w:type="first" r:id="rId8"/>
       <w:type w:val="nextPage"/>
       <w:pgSz w:w="12240" w:h="15840"/>
       <w:pgMar w:left="1080" w:right="1080" w:gutter="0" w:header="708" w:top="1080" w:footer="708" w:bottom="1080"/>
@@ -25966,8 +26085,8 @@
       <w:u w:val="single" w:color="FFFFFF"/>
     </w:rPr>
   </w:style>
-  <w:style w:type="character" w:styleId="Bulletsuser">
-    <w:name w:val="Bullets (user)"/>
+  <w:style w:type="character" w:styleId="Bullets">
+    <w:name w:val="Bullets"/>
     <w:qFormat/>
     <w:rPr>
       <w:rFonts w:ascii="OpenSymbol" w:hAnsi="OpenSymbol" w:eastAsia="OpenSymbol" w:cs="OpenSymbol"/>

</xml_diff>